<commit_message>
Stese fondamenta del report, fatto layout, scritte le motivazioni per cui abbiamo scelto gli adt che useremo
</commit_message>
<xml_diff>
--- a/Report.docx
+++ b/Report.docx
@@ -1,25 +1,1209 @@
 
 <file path=word/document.xml><?xml version="1.0" encoding="utf-8"?>
-<w:document xmlns:wpc="http://schemas.microsoft.com/office/word/2010/wordprocessingCanvas" xmlns:cx="http://schemas.microsoft.com/office/drawing/2014/chartex" xmlns:mc="http://schemas.openxmlformats.org/markup-compatibility/2006" xmlns:o="urn:schemas-microsoft-com:office:office" xmlns:r="http://schemas.openxmlformats.org/officeDocument/2006/relationships" xmlns:m="http://schemas.openxmlformats.org/officeDocument/2006/math" xmlns:v="urn:schemas-microsoft-com:vml" xmlns:wp14="http://schemas.microsoft.com/office/word/2010/wordprocessingDrawing" xmlns:wp="http://schemas.openxmlformats.org/drawingml/2006/wordprocessingDrawing" xmlns:w10="urn:schemas-microsoft-com:office:word" xmlns:w="http://schemas.openxmlformats.org/wordprocessingml/2006/main" xmlns:w14="http://schemas.microsoft.com/office/word/2010/wordml" xmlns:w15="http://schemas.microsoft.com/office/word/2012/wordml" xmlns:w16se="http://schemas.microsoft.com/office/word/2015/wordml/symex" xmlns:wpg="http://schemas.microsoft.com/office/word/2010/wordprocessingGroup" xmlns:wpi="http://schemas.microsoft.com/office/word/2010/wordprocessingInk" xmlns:wne="http://schemas.microsoft.com/office/word/2006/wordml" xmlns:wps="http://schemas.microsoft.com/office/word/2010/wordprocessingShape" mc:Ignorable="w14 w15 w16se wp14">
+<w:document xmlns:wpc="http://schemas.microsoft.com/office/word/2010/wordprocessingCanvas" xmlns:cx="http://schemas.microsoft.com/office/drawing/2014/chartex" xmlns:cx1="http://schemas.microsoft.com/office/drawing/2015/9/8/chartex" xmlns:cx2="http://schemas.microsoft.com/office/drawing/2015/10/21/chartex" xmlns:cx3="http://schemas.microsoft.com/office/drawing/2016/5/9/chartex" xmlns:cx4="http://schemas.microsoft.com/office/drawing/2016/5/10/chartex" xmlns:cx5="http://schemas.microsoft.com/office/drawing/2016/5/11/chartex" xmlns:cx6="http://schemas.microsoft.com/office/drawing/2016/5/12/chartex" xmlns:cx7="http://schemas.microsoft.com/office/drawing/2016/5/13/chartex" xmlns:cx8="http://schemas.microsoft.com/office/drawing/2016/5/14/chartex" xmlns:mc="http://schemas.openxmlformats.org/markup-compatibility/2006" xmlns:aink="http://schemas.microsoft.com/office/drawing/2016/ink" xmlns:am3d="http://schemas.microsoft.com/office/drawing/2017/model3d" xmlns:o="urn:schemas-microsoft-com:office:office" xmlns:oel="http://schemas.microsoft.com/office/2019/extlst" xmlns:r="http://schemas.openxmlformats.org/officeDocument/2006/relationships" xmlns:m="http://schemas.openxmlformats.org/officeDocument/2006/math" xmlns:v="urn:schemas-microsoft-com:vml" xmlns:wp14="http://schemas.microsoft.com/office/word/2010/wordprocessingDrawing" xmlns:wp="http://schemas.openxmlformats.org/drawingml/2006/wordprocessingDrawing" xmlns:w10="urn:schemas-microsoft-com:office:word" xmlns:w="http://schemas.openxmlformats.org/wordprocessingml/2006/main" xmlns:w14="http://schemas.microsoft.com/office/word/2010/wordml" xmlns:w15="http://schemas.microsoft.com/office/word/2012/wordml" xmlns:w16cex="http://schemas.microsoft.com/office/word/2018/wordml/cex" xmlns:w16cid="http://schemas.microsoft.com/office/word/2016/wordml/cid" xmlns:w16="http://schemas.microsoft.com/office/word/2018/wordml" xmlns:w16du="http://schemas.microsoft.com/office/word/2023/wordml/word16du" xmlns:w16sdtdh="http://schemas.microsoft.com/office/word/2020/wordml/sdtdatahash" xmlns:w16sdtfl="http://schemas.microsoft.com/office/word/2024/wordml/sdtformatlock" xmlns:w16se="http://schemas.microsoft.com/office/word/2015/wordml/symex" xmlns:wpg="http://schemas.microsoft.com/office/word/2010/wordprocessingGroup" xmlns:wpi="http://schemas.microsoft.com/office/word/2010/wordprocessingInk" xmlns:wne="http://schemas.microsoft.com/office/word/2006/wordml" xmlns:wps="http://schemas.microsoft.com/office/word/2010/wordprocessingShape" mc:Ignorable="w14 w15 w16se w16cid w16 w16cex w16sdtdh w16sdtfl w16du wp14">
   <w:body>
     <w:p>
       <w:pPr>
         <w:spacing w:line="276" w:lineRule="auto"/>
         <w:jc w:val="both"/>
         <w:rPr>
-          <w:rFonts w:ascii="Helvetica Rounded" w:hAnsi="Helvetica Rounded" w:cs="Helvetica"/>
+          <w:rFonts w:ascii="Helvetica" w:hAnsi="Helvetica" w:cs="Helvetica"/>
+          <w:b/>
+          <w:bCs/>
           <w:sz w:val="48"/>
           <w:szCs w:val="48"/>
         </w:rPr>
       </w:pPr>
       <w:r>
         <w:rPr>
-          <w:rFonts w:ascii="Helvetica Rounded" w:hAnsi="Helvetica Rounded" w:cs="Helvetica"/>
+          <w:rFonts w:ascii="Helvetica" w:hAnsi="Helvetica" w:cs="Helvetica"/>
+          <w:b/>
+          <w:bCs/>
           <w:sz w:val="48"/>
           <w:szCs w:val="48"/>
         </w:rPr>
         <w:t>Report Manutenzione Condominio</w:t>
       </w:r>
+    </w:p>
+    <w:p>
+      <w:pPr>
+        <w:pStyle w:val="Titolo1"/>
+        <w:rPr>
+          <w:rFonts w:ascii="Helvetica" w:hAnsi="Helvetica" w:cs="Helvetica"/>
+          <w:b/>
+          <w:bCs/>
+          <w:color w:val="auto"/>
+        </w:rPr>
+      </w:pPr>
+      <w:r>
+        <w:rPr>
+          <w:rFonts w:ascii="Helvetica" w:hAnsi="Helvetica" w:cs="Helvetica"/>
+          <w:b/>
+          <w:bCs/>
+          <w:color w:val="auto"/>
+        </w:rPr>
+        <w:t>Motivazione ADT</w:t>
+      </w:r>
+    </w:p>
+    <w:p>
+      <w:pPr>
+        <w:pStyle w:val="NormaleWeb"/>
+        <w:numPr>
+          <w:ilvl w:val="0"/>
+          <w:numId w:val="3"/>
+        </w:numPr>
+        <w:rPr>
+          <w:rFonts w:ascii="Helvetica" w:hAnsi="Helvetica" w:cs="Helvetica"/>
+          <w:b/>
+          <w:bCs/>
+          <w:color w:val="C00000"/>
+        </w:rPr>
+      </w:pPr>
+      <w:r>
+        <w:rPr>
+          <w:rFonts w:ascii="Helvetica" w:hAnsi="Helvetica" w:cs="Helvetica"/>
+          <w:b/>
+          <w:bCs/>
+          <w:color w:val="C00000"/>
+        </w:rPr>
+        <w:t xml:space="preserve">ADT </w:t>
+      </w:r>
+      <w:proofErr w:type="spellStart"/>
+      <w:r>
+        <w:rPr>
+          <w:rStyle w:val="CodiceHTML"/>
+          <w:rFonts w:ascii="Helvetica" w:hAnsi="Helvetica" w:cs="Helvetica"/>
+          <w:b/>
+          <w:bCs/>
+          <w:color w:val="C00000"/>
+        </w:rPr>
+        <w:t>InterventionRequest</w:t>
+      </w:r>
+      <w:proofErr w:type="spellEnd"/>
+      <w:r>
+        <w:rPr>
+          <w:rFonts w:ascii="Helvetica" w:hAnsi="Helvetica" w:cs="Helvetica"/>
+          <w:b/>
+          <w:bCs/>
+          <w:color w:val="C00000"/>
+        </w:rPr>
+        <w:t xml:space="preserve"> (Gestione Richieste e Urgenze)</w:t>
+      </w:r>
+    </w:p>
+    <w:p>
+      <w:pPr>
+        <w:pStyle w:val="NormaleWeb"/>
+        <w:numPr>
+          <w:ilvl w:val="1"/>
+          <w:numId w:val="3"/>
+        </w:numPr>
+        <w:rPr>
+          <w:rFonts w:ascii="Helvetica" w:hAnsi="Helvetica" w:cs="Helvetica"/>
+          <w:b/>
+          <w:bCs/>
+        </w:rPr>
+      </w:pPr>
+      <w:r>
+        <w:rPr>
+          <w:rFonts w:ascii="Helvetica" w:hAnsi="Helvetica" w:cs="Helvetica"/>
+          <w:b/>
+          <w:bCs/>
+          <w:u w:val="single"/>
+        </w:rPr>
+        <w:t>L'ADT Coda a Priorità (Heap)</w:t>
+      </w:r>
+      <w:r>
+        <w:rPr>
+          <w:rFonts w:ascii="Helvetica" w:hAnsi="Helvetica" w:cs="Helvetica"/>
+        </w:rPr>
+        <w:t xml:space="preserve"> è la scelta ingegneristica ottimale perché il dominio del problema richiede esplicitamente la gestione di richieste basate su "livello di urgenza". Mentre una lista richiederebbe tempo lineare </w:t>
+      </w:r>
+      <w:r>
+        <w:rPr>
+          <w:rStyle w:val="math"/>
+          <w:rFonts w:ascii="Helvetica" w:hAnsi="Helvetica" w:cs="Helvetica"/>
+        </w:rPr>
+        <w:t>O(n)</w:t>
+      </w:r>
+      <w:r>
+        <w:rPr>
+          <w:rFonts w:ascii="Helvetica" w:hAnsi="Helvetica" w:cs="Helvetica"/>
+        </w:rPr>
+        <w:t xml:space="preserve"> per inserire ogni nuova richiesta mantenendo l'ordinamento, l'Heap garantisce inserimento ed estrazione dell'intervento più urgente in tempo logaritmico </w:t>
+      </w:r>
+      <w:proofErr w:type="gramStart"/>
+      <w:r>
+        <w:rPr>
+          <w:rStyle w:val="math"/>
+          <w:rFonts w:ascii="Helvetica" w:hAnsi="Helvetica" w:cs="Helvetica"/>
+        </w:rPr>
+        <w:t>O(</w:t>
+      </w:r>
+      <w:proofErr w:type="gramEnd"/>
+      <w:r>
+        <w:rPr>
+          <w:rStyle w:val="math"/>
+          <w:rFonts w:ascii="Helvetica" w:hAnsi="Helvetica" w:cs="Helvetica"/>
+        </w:rPr>
+        <w:t>\log n)</w:t>
+      </w:r>
+      <w:r>
+        <w:rPr>
+          <w:rFonts w:ascii="Helvetica" w:hAnsi="Helvetica" w:cs="Helvetica"/>
+        </w:rPr>
+        <w:t>, risultando drasticamente più efficiente al crescere del numero di richieste nel condominio.</w:t>
+      </w:r>
+    </w:p>
+    <w:p>
+      <w:pPr>
+        <w:pStyle w:val="NormaleWeb"/>
+        <w:numPr>
+          <w:ilvl w:val="2"/>
+          <w:numId w:val="3"/>
+        </w:numPr>
+        <w:rPr>
+          <w:rFonts w:ascii="Helvetica" w:hAnsi="Helvetica" w:cs="Helvetica"/>
+          <w:b/>
+          <w:bCs/>
+        </w:rPr>
+      </w:pPr>
+      <w:r>
+        <w:rPr>
+          <w:rFonts w:ascii="Helvetica" w:hAnsi="Helvetica" w:cs="Helvetica"/>
+          <w:b/>
+          <w:bCs/>
+        </w:rPr>
+        <w:t>Funzione x</w:t>
+      </w:r>
+      <w:r>
+        <w:rPr>
+          <w:rFonts w:ascii="Helvetica" w:hAnsi="Helvetica" w:cs="Helvetica"/>
+          <w:i/>
+          <w:iCs/>
+        </w:rPr>
+        <w:t xml:space="preserve"> </w:t>
+      </w:r>
+    </w:p>
+    <w:tbl>
+      <w:tblPr>
+        <w:tblStyle w:val="Grigliatabella"/>
+        <w:tblW w:w="0" w:type="auto"/>
+        <w:tblInd w:w="2880" w:type="dxa"/>
+        <w:tblLook w:val="04A0" w:firstRow="1" w:lastRow="0" w:firstColumn="1" w:lastColumn="0" w:noHBand="0" w:noVBand="1"/>
+      </w:tblPr>
+      <w:tblGrid>
+        <w:gridCol w:w="3349"/>
+        <w:gridCol w:w="3399"/>
+      </w:tblGrid>
+      <w:tr>
+        <w:tc>
+          <w:tcPr>
+            <w:tcW w:w="4814" w:type="dxa"/>
+          </w:tcPr>
+          <w:p>
+            <w:pPr>
+              <w:pStyle w:val="NormaleWeb"/>
+              <w:rPr>
+                <w:rFonts w:ascii="Helvetica" w:hAnsi="Helvetica" w:cs="Helvetica"/>
+                <w:b/>
+                <w:bCs/>
+              </w:rPr>
+            </w:pPr>
+            <w:r>
+              <w:rPr>
+                <w:rFonts w:ascii="Helvetica" w:hAnsi="Helvetica" w:cs="Helvetica"/>
+                <w:b/>
+                <w:bCs/>
+              </w:rPr>
+              <w:t>Specifica sintattica</w:t>
+            </w:r>
+          </w:p>
+        </w:tc>
+        <w:tc>
+          <w:tcPr>
+            <w:tcW w:w="4814" w:type="dxa"/>
+          </w:tcPr>
+          <w:p>
+            <w:pPr>
+              <w:pStyle w:val="NormaleWeb"/>
+              <w:rPr>
+                <w:rFonts w:ascii="Helvetica" w:hAnsi="Helvetica" w:cs="Helvetica"/>
+                <w:b/>
+                <w:bCs/>
+              </w:rPr>
+            </w:pPr>
+            <w:r>
+              <w:rPr>
+                <w:rFonts w:ascii="Helvetica" w:hAnsi="Helvetica" w:cs="Helvetica"/>
+                <w:b/>
+                <w:bCs/>
+              </w:rPr>
+              <w:t>Specifica semantica</w:t>
+            </w:r>
+          </w:p>
+        </w:tc>
+      </w:tr>
+      <w:tr>
+        <w:tc>
+          <w:tcPr>
+            <w:tcW w:w="4814" w:type="dxa"/>
+          </w:tcPr>
+          <w:p>
+            <w:pPr>
+              <w:pStyle w:val="NormaleWeb"/>
+              <w:rPr>
+                <w:rFonts w:ascii="Helvetica" w:hAnsi="Helvetica" w:cs="Helvetica"/>
+              </w:rPr>
+            </w:pPr>
+            <w:proofErr w:type="spellStart"/>
+            <w:r>
+              <w:rPr>
+                <w:rFonts w:ascii="Helvetica" w:hAnsi="Helvetica" w:cs="Helvetica"/>
+              </w:rPr>
+              <w:t>sdfsdf</w:t>
+            </w:r>
+            <w:proofErr w:type="spellEnd"/>
+          </w:p>
+        </w:tc>
+        <w:tc>
+          <w:tcPr>
+            <w:tcW w:w="4814" w:type="dxa"/>
+          </w:tcPr>
+          <w:p>
+            <w:pPr>
+              <w:pStyle w:val="NormaleWeb"/>
+              <w:rPr>
+                <w:rFonts w:ascii="Helvetica" w:hAnsi="Helvetica" w:cs="Helvetica"/>
+              </w:rPr>
+            </w:pPr>
+            <w:proofErr w:type="spellStart"/>
+            <w:r>
+              <w:rPr>
+                <w:rFonts w:ascii="Helvetica" w:hAnsi="Helvetica" w:cs="Helvetica"/>
+              </w:rPr>
+              <w:t>sdfsdfs</w:t>
+            </w:r>
+            <w:proofErr w:type="spellEnd"/>
+          </w:p>
+        </w:tc>
+      </w:tr>
+    </w:tbl>
+    <w:p>
+      <w:pPr>
+        <w:pStyle w:val="NormaleWeb"/>
+        <w:numPr>
+          <w:ilvl w:val="2"/>
+          <w:numId w:val="3"/>
+        </w:numPr>
+        <w:rPr>
+          <w:rFonts w:ascii="Helvetica" w:hAnsi="Helvetica" w:cs="Helvetica"/>
+          <w:b/>
+          <w:bCs/>
+        </w:rPr>
+      </w:pPr>
+      <w:r>
+        <w:rPr>
+          <w:rFonts w:ascii="Helvetica" w:hAnsi="Helvetica" w:cs="Helvetica"/>
+          <w:b/>
+          <w:bCs/>
+        </w:rPr>
+        <w:t xml:space="preserve">Funzione y </w:t>
+      </w:r>
+    </w:p>
+    <w:tbl>
+      <w:tblPr>
+        <w:tblStyle w:val="Grigliatabella"/>
+        <w:tblW w:w="0" w:type="auto"/>
+        <w:tblInd w:w="2880" w:type="dxa"/>
+        <w:tblLook w:val="04A0" w:firstRow="1" w:lastRow="0" w:firstColumn="1" w:lastColumn="0" w:noHBand="0" w:noVBand="1"/>
+      </w:tblPr>
+      <w:tblGrid>
+        <w:gridCol w:w="3349"/>
+        <w:gridCol w:w="3399"/>
+      </w:tblGrid>
+      <w:tr>
+        <w:tc>
+          <w:tcPr>
+            <w:tcW w:w="4814" w:type="dxa"/>
+          </w:tcPr>
+          <w:p>
+            <w:pPr>
+              <w:pStyle w:val="NormaleWeb"/>
+              <w:rPr>
+                <w:rFonts w:ascii="Helvetica" w:hAnsi="Helvetica" w:cs="Helvetica"/>
+                <w:b/>
+                <w:bCs/>
+              </w:rPr>
+            </w:pPr>
+            <w:r>
+              <w:rPr>
+                <w:rFonts w:ascii="Helvetica" w:hAnsi="Helvetica" w:cs="Helvetica"/>
+                <w:b/>
+                <w:bCs/>
+              </w:rPr>
+              <w:t>Specifica sintattica</w:t>
+            </w:r>
+          </w:p>
+        </w:tc>
+        <w:tc>
+          <w:tcPr>
+            <w:tcW w:w="4814" w:type="dxa"/>
+          </w:tcPr>
+          <w:p>
+            <w:pPr>
+              <w:pStyle w:val="NormaleWeb"/>
+              <w:rPr>
+                <w:rFonts w:ascii="Helvetica" w:hAnsi="Helvetica" w:cs="Helvetica"/>
+                <w:b/>
+                <w:bCs/>
+              </w:rPr>
+            </w:pPr>
+            <w:r>
+              <w:rPr>
+                <w:rFonts w:ascii="Helvetica" w:hAnsi="Helvetica" w:cs="Helvetica"/>
+                <w:b/>
+                <w:bCs/>
+              </w:rPr>
+              <w:t>Specifica semantica</w:t>
+            </w:r>
+          </w:p>
+        </w:tc>
+      </w:tr>
+      <w:tr>
+        <w:tc>
+          <w:tcPr>
+            <w:tcW w:w="4814" w:type="dxa"/>
+          </w:tcPr>
+          <w:p>
+            <w:pPr>
+              <w:pStyle w:val="NormaleWeb"/>
+              <w:rPr>
+                <w:rFonts w:ascii="Helvetica" w:hAnsi="Helvetica" w:cs="Helvetica"/>
+              </w:rPr>
+            </w:pPr>
+            <w:proofErr w:type="spellStart"/>
+            <w:r>
+              <w:rPr>
+                <w:rFonts w:ascii="Helvetica" w:hAnsi="Helvetica" w:cs="Helvetica"/>
+              </w:rPr>
+              <w:t>sdfsdf</w:t>
+            </w:r>
+            <w:proofErr w:type="spellEnd"/>
+          </w:p>
+        </w:tc>
+        <w:tc>
+          <w:tcPr>
+            <w:tcW w:w="4814" w:type="dxa"/>
+          </w:tcPr>
+          <w:p>
+            <w:pPr>
+              <w:pStyle w:val="NormaleWeb"/>
+              <w:rPr>
+                <w:rFonts w:ascii="Helvetica" w:hAnsi="Helvetica" w:cs="Helvetica"/>
+              </w:rPr>
+            </w:pPr>
+            <w:proofErr w:type="spellStart"/>
+            <w:r>
+              <w:rPr>
+                <w:rFonts w:ascii="Helvetica" w:hAnsi="Helvetica" w:cs="Helvetica"/>
+              </w:rPr>
+              <w:t>sdfsdfs</w:t>
+            </w:r>
+            <w:proofErr w:type="spellEnd"/>
+          </w:p>
+        </w:tc>
+      </w:tr>
+    </w:tbl>
+    <w:p>
+      <w:pPr>
+        <w:pStyle w:val="NormaleWeb"/>
+        <w:rPr>
+          <w:rFonts w:ascii="Helvetica" w:hAnsi="Helvetica" w:cs="Helvetica"/>
+        </w:rPr>
+      </w:pPr>
+    </w:p>
+    <w:p>
+      <w:pPr>
+        <w:pStyle w:val="NormaleWeb"/>
+        <w:numPr>
+          <w:ilvl w:val="0"/>
+          <w:numId w:val="3"/>
+        </w:numPr>
+        <w:rPr>
+          <w:rFonts w:ascii="Helvetica" w:hAnsi="Helvetica" w:cs="Helvetica"/>
+          <w:b/>
+          <w:bCs/>
+          <w:color w:val="C00000"/>
+        </w:rPr>
+      </w:pPr>
+      <w:r>
+        <w:rPr>
+          <w:rFonts w:ascii="Helvetica" w:hAnsi="Helvetica" w:cs="Helvetica"/>
+          <w:b/>
+          <w:bCs/>
+          <w:color w:val="C00000"/>
+        </w:rPr>
+        <w:t xml:space="preserve">ADT </w:t>
+      </w:r>
+      <w:r>
+        <w:rPr>
+          <w:rStyle w:val="CodiceHTML"/>
+          <w:rFonts w:ascii="Helvetica" w:hAnsi="Helvetica" w:cs="Helvetica"/>
+          <w:b/>
+          <w:bCs/>
+          <w:color w:val="C00000"/>
+        </w:rPr>
+        <w:t>Schedule</w:t>
+      </w:r>
+      <w:r>
+        <w:rPr>
+          <w:rFonts w:ascii="Helvetica" w:hAnsi="Helvetica" w:cs="Helvetica"/>
+          <w:b/>
+          <w:bCs/>
+          <w:color w:val="C00000"/>
+        </w:rPr>
+        <w:t xml:space="preserve"> (Gestione Pianificazione e Conflitti)</w:t>
+      </w:r>
+    </w:p>
+    <w:p>
+      <w:pPr>
+        <w:pStyle w:val="NormaleWeb"/>
+        <w:numPr>
+          <w:ilvl w:val="1"/>
+          <w:numId w:val="3"/>
+        </w:numPr>
+        <w:rPr>
+          <w:rFonts w:ascii="Helvetica" w:hAnsi="Helvetica" w:cs="Helvetica"/>
+        </w:rPr>
+      </w:pPr>
+      <w:r>
+        <w:rPr>
+          <w:rFonts w:ascii="Helvetica" w:hAnsi="Helvetica" w:cs="Helvetica"/>
+          <w:b/>
+          <w:bCs/>
+          <w:u w:val="single"/>
+        </w:rPr>
+        <w:t>L'Albero Binario di Ricerca</w:t>
+      </w:r>
+      <w:r>
+        <w:rPr>
+          <w:rFonts w:ascii="Helvetica" w:hAnsi="Helvetica" w:cs="Helvetica"/>
+        </w:rPr>
+        <w:t xml:space="preserve"> è la struttura dati d'elezione per insiemi dinamicamente ordinati. La verifica dei conflitti nella pianificazione temporale si traduce nella ricerca di una sovrapposizione di chiavi (data/ora). Il BST permette di ridurre la complessità computazionale di inserimento e verifica dei conflitti da </w:t>
+      </w:r>
+      <w:r>
+        <w:rPr>
+          <w:rStyle w:val="math"/>
+          <w:rFonts w:ascii="Helvetica" w:hAnsi="Helvetica" w:cs="Helvetica"/>
+        </w:rPr>
+        <w:t>O(n)</w:t>
+      </w:r>
+      <w:r>
+        <w:rPr>
+          <w:rFonts w:ascii="Helvetica" w:hAnsi="Helvetica" w:cs="Helvetica"/>
+        </w:rPr>
+        <w:t xml:space="preserve"> (richiesto da una lista) a </w:t>
+      </w:r>
+      <w:proofErr w:type="gramStart"/>
+      <w:r>
+        <w:rPr>
+          <w:rStyle w:val="math"/>
+          <w:rFonts w:ascii="Helvetica" w:hAnsi="Helvetica" w:cs="Helvetica"/>
+        </w:rPr>
+        <w:t>O(</w:t>
+      </w:r>
+      <w:proofErr w:type="gramEnd"/>
+      <w:r>
+        <w:rPr>
+          <w:rStyle w:val="math"/>
+          <w:rFonts w:ascii="Helvetica" w:hAnsi="Helvetica" w:cs="Helvetica"/>
+        </w:rPr>
+        <w:t>\log n)</w:t>
+      </w:r>
+      <w:r>
+        <w:rPr>
+          <w:rFonts w:ascii="Helvetica" w:hAnsi="Helvetica" w:cs="Helvetica"/>
+        </w:rPr>
+        <w:t xml:space="preserve">, garantendo altissime prestazioni. Inoltre, applicando un algoritmo di </w:t>
+      </w:r>
+      <w:r>
+        <w:rPr>
+          <w:rStyle w:val="Enfasicorsivo"/>
+          <w:rFonts w:ascii="Helvetica" w:hAnsi="Helvetica" w:cs="Helvetica"/>
+        </w:rPr>
+        <w:t>Visita Simmetrica</w:t>
+      </w:r>
+      <w:r>
+        <w:rPr>
+          <w:rFonts w:ascii="Helvetica" w:hAnsi="Helvetica" w:cs="Helvetica"/>
+        </w:rPr>
+        <w:t xml:space="preserve"> (In-Order), l'albero restituisce intrinsecamente lo storico degli interventi ordinato cronologicamente, soddisfacendo perfettamente il requisito di generazione dei report temporali.</w:t>
+      </w:r>
+    </w:p>
+    <w:p>
+      <w:pPr>
+        <w:pStyle w:val="NormaleWeb"/>
+        <w:numPr>
+          <w:ilvl w:val="2"/>
+          <w:numId w:val="3"/>
+        </w:numPr>
+        <w:rPr>
+          <w:rFonts w:ascii="Helvetica" w:hAnsi="Helvetica" w:cs="Helvetica"/>
+          <w:b/>
+          <w:bCs/>
+        </w:rPr>
+      </w:pPr>
+      <w:r>
+        <w:rPr>
+          <w:rFonts w:ascii="Helvetica" w:hAnsi="Helvetica" w:cs="Helvetica"/>
+          <w:b/>
+          <w:bCs/>
+        </w:rPr>
+        <w:t>Funzione x</w:t>
+      </w:r>
+      <w:r>
+        <w:rPr>
+          <w:rFonts w:ascii="Helvetica" w:hAnsi="Helvetica" w:cs="Helvetica"/>
+          <w:i/>
+          <w:iCs/>
+        </w:rPr>
+        <w:t xml:space="preserve"> </w:t>
+      </w:r>
+    </w:p>
+    <w:tbl>
+      <w:tblPr>
+        <w:tblStyle w:val="Grigliatabella"/>
+        <w:tblW w:w="0" w:type="auto"/>
+        <w:tblInd w:w="2880" w:type="dxa"/>
+        <w:tblLook w:val="04A0" w:firstRow="1" w:lastRow="0" w:firstColumn="1" w:lastColumn="0" w:noHBand="0" w:noVBand="1"/>
+      </w:tblPr>
+      <w:tblGrid>
+        <w:gridCol w:w="3349"/>
+        <w:gridCol w:w="3399"/>
+      </w:tblGrid>
+      <w:tr>
+        <w:tc>
+          <w:tcPr>
+            <w:tcW w:w="4814" w:type="dxa"/>
+          </w:tcPr>
+          <w:p>
+            <w:pPr>
+              <w:pStyle w:val="NormaleWeb"/>
+              <w:rPr>
+                <w:rFonts w:ascii="Helvetica" w:hAnsi="Helvetica" w:cs="Helvetica"/>
+                <w:b/>
+                <w:bCs/>
+              </w:rPr>
+            </w:pPr>
+            <w:r>
+              <w:rPr>
+                <w:rFonts w:ascii="Helvetica" w:hAnsi="Helvetica" w:cs="Helvetica"/>
+                <w:b/>
+                <w:bCs/>
+              </w:rPr>
+              <w:t>Specifica sintattica</w:t>
+            </w:r>
+          </w:p>
+        </w:tc>
+        <w:tc>
+          <w:tcPr>
+            <w:tcW w:w="4814" w:type="dxa"/>
+          </w:tcPr>
+          <w:p>
+            <w:pPr>
+              <w:pStyle w:val="NormaleWeb"/>
+              <w:rPr>
+                <w:rFonts w:ascii="Helvetica" w:hAnsi="Helvetica" w:cs="Helvetica"/>
+                <w:b/>
+                <w:bCs/>
+              </w:rPr>
+            </w:pPr>
+            <w:r>
+              <w:rPr>
+                <w:rFonts w:ascii="Helvetica" w:hAnsi="Helvetica" w:cs="Helvetica"/>
+                <w:b/>
+                <w:bCs/>
+              </w:rPr>
+              <w:t>Specifica semantica</w:t>
+            </w:r>
+          </w:p>
+        </w:tc>
+      </w:tr>
+      <w:tr>
+        <w:tc>
+          <w:tcPr>
+            <w:tcW w:w="4814" w:type="dxa"/>
+          </w:tcPr>
+          <w:p>
+            <w:pPr>
+              <w:pStyle w:val="NormaleWeb"/>
+              <w:rPr>
+                <w:rFonts w:ascii="Helvetica" w:hAnsi="Helvetica" w:cs="Helvetica"/>
+              </w:rPr>
+            </w:pPr>
+            <w:proofErr w:type="spellStart"/>
+            <w:r>
+              <w:rPr>
+                <w:rFonts w:ascii="Helvetica" w:hAnsi="Helvetica" w:cs="Helvetica"/>
+              </w:rPr>
+              <w:t>sdfsdf</w:t>
+            </w:r>
+            <w:proofErr w:type="spellEnd"/>
+          </w:p>
+        </w:tc>
+        <w:tc>
+          <w:tcPr>
+            <w:tcW w:w="4814" w:type="dxa"/>
+          </w:tcPr>
+          <w:p>
+            <w:pPr>
+              <w:pStyle w:val="NormaleWeb"/>
+              <w:rPr>
+                <w:rFonts w:ascii="Helvetica" w:hAnsi="Helvetica" w:cs="Helvetica"/>
+              </w:rPr>
+            </w:pPr>
+            <w:proofErr w:type="spellStart"/>
+            <w:r>
+              <w:rPr>
+                <w:rFonts w:ascii="Helvetica" w:hAnsi="Helvetica" w:cs="Helvetica"/>
+              </w:rPr>
+              <w:t>sdfsdfs</w:t>
+            </w:r>
+            <w:proofErr w:type="spellEnd"/>
+          </w:p>
+        </w:tc>
+      </w:tr>
+    </w:tbl>
+    <w:p>
+      <w:pPr>
+        <w:pStyle w:val="NormaleWeb"/>
+        <w:numPr>
+          <w:ilvl w:val="2"/>
+          <w:numId w:val="3"/>
+        </w:numPr>
+        <w:rPr>
+          <w:rFonts w:ascii="Helvetica" w:hAnsi="Helvetica" w:cs="Helvetica"/>
+          <w:b/>
+          <w:bCs/>
+        </w:rPr>
+      </w:pPr>
+      <w:r>
+        <w:rPr>
+          <w:rFonts w:ascii="Helvetica" w:hAnsi="Helvetica" w:cs="Helvetica"/>
+          <w:b/>
+          <w:bCs/>
+        </w:rPr>
+        <w:t xml:space="preserve">Funzione y </w:t>
+      </w:r>
+    </w:p>
+    <w:tbl>
+      <w:tblPr>
+        <w:tblStyle w:val="Grigliatabella"/>
+        <w:tblW w:w="0" w:type="auto"/>
+        <w:tblInd w:w="2880" w:type="dxa"/>
+        <w:tblLook w:val="04A0" w:firstRow="1" w:lastRow="0" w:firstColumn="1" w:lastColumn="0" w:noHBand="0" w:noVBand="1"/>
+      </w:tblPr>
+      <w:tblGrid>
+        <w:gridCol w:w="3349"/>
+        <w:gridCol w:w="3399"/>
+      </w:tblGrid>
+      <w:tr>
+        <w:tc>
+          <w:tcPr>
+            <w:tcW w:w="4814" w:type="dxa"/>
+          </w:tcPr>
+          <w:p>
+            <w:pPr>
+              <w:pStyle w:val="NormaleWeb"/>
+              <w:rPr>
+                <w:rFonts w:ascii="Helvetica" w:hAnsi="Helvetica" w:cs="Helvetica"/>
+                <w:b/>
+                <w:bCs/>
+              </w:rPr>
+            </w:pPr>
+            <w:r>
+              <w:rPr>
+                <w:rFonts w:ascii="Helvetica" w:hAnsi="Helvetica" w:cs="Helvetica"/>
+                <w:b/>
+                <w:bCs/>
+              </w:rPr>
+              <w:t>Specifica sintattica</w:t>
+            </w:r>
+          </w:p>
+        </w:tc>
+        <w:tc>
+          <w:tcPr>
+            <w:tcW w:w="4814" w:type="dxa"/>
+          </w:tcPr>
+          <w:p>
+            <w:pPr>
+              <w:pStyle w:val="NormaleWeb"/>
+              <w:rPr>
+                <w:rFonts w:ascii="Helvetica" w:hAnsi="Helvetica" w:cs="Helvetica"/>
+                <w:b/>
+                <w:bCs/>
+              </w:rPr>
+            </w:pPr>
+            <w:r>
+              <w:rPr>
+                <w:rFonts w:ascii="Helvetica" w:hAnsi="Helvetica" w:cs="Helvetica"/>
+                <w:b/>
+                <w:bCs/>
+              </w:rPr>
+              <w:t>Specifica semantica</w:t>
+            </w:r>
+          </w:p>
+        </w:tc>
+      </w:tr>
+      <w:tr>
+        <w:tc>
+          <w:tcPr>
+            <w:tcW w:w="4814" w:type="dxa"/>
+          </w:tcPr>
+          <w:p>
+            <w:pPr>
+              <w:pStyle w:val="NormaleWeb"/>
+              <w:rPr>
+                <w:rFonts w:ascii="Helvetica" w:hAnsi="Helvetica" w:cs="Helvetica"/>
+              </w:rPr>
+            </w:pPr>
+            <w:proofErr w:type="spellStart"/>
+            <w:r>
+              <w:rPr>
+                <w:rFonts w:ascii="Helvetica" w:hAnsi="Helvetica" w:cs="Helvetica"/>
+              </w:rPr>
+              <w:t>sdfsdf</w:t>
+            </w:r>
+            <w:proofErr w:type="spellEnd"/>
+          </w:p>
+        </w:tc>
+        <w:tc>
+          <w:tcPr>
+            <w:tcW w:w="4814" w:type="dxa"/>
+          </w:tcPr>
+          <w:p>
+            <w:pPr>
+              <w:pStyle w:val="NormaleWeb"/>
+              <w:rPr>
+                <w:rFonts w:ascii="Helvetica" w:hAnsi="Helvetica" w:cs="Helvetica"/>
+              </w:rPr>
+            </w:pPr>
+            <w:proofErr w:type="spellStart"/>
+            <w:r>
+              <w:rPr>
+                <w:rFonts w:ascii="Helvetica" w:hAnsi="Helvetica" w:cs="Helvetica"/>
+              </w:rPr>
+              <w:t>sdfsdfs</w:t>
+            </w:r>
+            <w:proofErr w:type="spellEnd"/>
+          </w:p>
+        </w:tc>
+      </w:tr>
+    </w:tbl>
+    <w:p>
+      <w:pPr>
+        <w:pStyle w:val="NormaleWeb"/>
+        <w:numPr>
+          <w:ilvl w:val="1"/>
+          <w:numId w:val="3"/>
+        </w:numPr>
+        <w:rPr>
+          <w:rFonts w:ascii="Helvetica" w:hAnsi="Helvetica" w:cs="Helvetica"/>
+        </w:rPr>
+      </w:pPr>
+    </w:p>
+    <w:p>
+      <w:pPr>
+        <w:pStyle w:val="NormaleWeb"/>
+        <w:numPr>
+          <w:ilvl w:val="0"/>
+          <w:numId w:val="3"/>
+        </w:numPr>
+        <w:rPr>
+          <w:rFonts w:ascii="Helvetica" w:hAnsi="Helvetica" w:cs="Helvetica"/>
+          <w:b/>
+          <w:bCs/>
+          <w:color w:val="C00000"/>
+        </w:rPr>
+      </w:pPr>
+      <w:r>
+        <w:rPr>
+          <w:rFonts w:ascii="Helvetica" w:hAnsi="Helvetica" w:cs="Helvetica"/>
+          <w:b/>
+          <w:bCs/>
+          <w:color w:val="C00000"/>
+        </w:rPr>
+        <w:t xml:space="preserve">ADT </w:t>
+      </w:r>
+      <w:proofErr w:type="spellStart"/>
+      <w:r>
+        <w:rPr>
+          <w:rStyle w:val="CodiceHTML"/>
+          <w:rFonts w:ascii="Helvetica" w:hAnsi="Helvetica" w:cs="Helvetica"/>
+          <w:b/>
+          <w:bCs/>
+          <w:color w:val="C00000"/>
+        </w:rPr>
+        <w:t>Technician</w:t>
+      </w:r>
+      <w:proofErr w:type="spellEnd"/>
+      <w:r>
+        <w:rPr>
+          <w:rFonts w:ascii="Helvetica" w:hAnsi="Helvetica" w:cs="Helvetica"/>
+          <w:b/>
+          <w:bCs/>
+          <w:color w:val="C00000"/>
+        </w:rPr>
+        <w:t xml:space="preserve"> (Gestione Tecnici)</w:t>
+      </w:r>
+    </w:p>
+    <w:p>
+      <w:pPr>
+        <w:pStyle w:val="NormaleWeb"/>
+        <w:numPr>
+          <w:ilvl w:val="1"/>
+          <w:numId w:val="3"/>
+        </w:numPr>
+        <w:rPr>
+          <w:rFonts w:ascii="Helvetica" w:hAnsi="Helvetica" w:cs="Helvetica"/>
+        </w:rPr>
+      </w:pPr>
+      <w:r>
+        <w:rPr>
+          <w:rFonts w:ascii="Helvetica" w:hAnsi="Helvetica" w:cs="Helvetica"/>
+        </w:rPr>
+        <w:t xml:space="preserve">L'utilizzo della </w:t>
+      </w:r>
+      <w:r>
+        <w:rPr>
+          <w:rStyle w:val="Enfasigrassetto"/>
+          <w:rFonts w:ascii="Helvetica" w:hAnsi="Helvetica" w:cs="Helvetica"/>
+          <w:u w:val="single"/>
+        </w:rPr>
+        <w:t>Lista Concatenata Semplice</w:t>
+      </w:r>
+      <w:r>
+        <w:rPr>
+          <w:rFonts w:ascii="Helvetica" w:hAnsi="Helvetica" w:cs="Helvetica"/>
+        </w:rPr>
+        <w:t xml:space="preserve"> è la scelta più indicata qualora il numero di tecnici sia dinamico e soggetto a frequenti aggiornamenti </w:t>
+      </w:r>
+      <w:r>
+        <w:rPr>
+          <w:rFonts w:ascii="Helvetica" w:hAnsi="Helvetica" w:cs="Helvetica"/>
+        </w:rPr>
+        <w:lastRenderedPageBreak/>
+        <w:t xml:space="preserve">(assunzioni, licenziamenti). Essendo le operazioni di ricerca per ID lineari </w:t>
+      </w:r>
+      <w:r>
+        <w:rPr>
+          <w:rStyle w:val="math"/>
+          <w:rFonts w:ascii="Helvetica" w:hAnsi="Helvetica" w:cs="Helvetica"/>
+        </w:rPr>
+        <w:t>O(n)</w:t>
+      </w:r>
+      <w:r>
+        <w:rPr>
+          <w:rFonts w:ascii="Helvetica" w:hAnsi="Helvetica" w:cs="Helvetica"/>
+        </w:rPr>
+        <w:t xml:space="preserve"> sia per la lista che per l'array non ordinato, la lista evita il costo computazionale </w:t>
+      </w:r>
+      <w:r>
+        <w:rPr>
+          <w:rStyle w:val="math"/>
+          <w:rFonts w:ascii="Helvetica" w:hAnsi="Helvetica" w:cs="Helvetica"/>
+        </w:rPr>
+        <w:t>O(n)</w:t>
+      </w:r>
+      <w:r>
+        <w:rPr>
+          <w:rFonts w:ascii="Helvetica" w:hAnsi="Helvetica" w:cs="Helvetica"/>
+        </w:rPr>
+        <w:t xml:space="preserve"> del ridimensionamento strutturale (</w:t>
+      </w:r>
+      <w:proofErr w:type="spellStart"/>
+      <w:r>
+        <w:rPr>
+          <w:rStyle w:val="CodiceHTML"/>
+          <w:rFonts w:ascii="Helvetica" w:hAnsi="Helvetica" w:cs="Helvetica"/>
+        </w:rPr>
+        <w:t>realloc</w:t>
+      </w:r>
+      <w:proofErr w:type="spellEnd"/>
+      <w:r>
+        <w:rPr>
+          <w:rFonts w:ascii="Helvetica" w:hAnsi="Helvetica" w:cs="Helvetica"/>
+        </w:rPr>
+        <w:t xml:space="preserve"> e copia degli elementi) tipico degli array dinamici quando la capacità massima viene raggiunta.</w:t>
+      </w:r>
+    </w:p>
+    <w:p>
+      <w:pPr>
+        <w:pStyle w:val="NormaleWeb"/>
+        <w:numPr>
+          <w:ilvl w:val="2"/>
+          <w:numId w:val="3"/>
+        </w:numPr>
+        <w:rPr>
+          <w:rFonts w:ascii="Helvetica" w:hAnsi="Helvetica" w:cs="Helvetica"/>
+          <w:b/>
+          <w:bCs/>
+        </w:rPr>
+      </w:pPr>
+      <w:r>
+        <w:rPr>
+          <w:rFonts w:ascii="Helvetica" w:hAnsi="Helvetica" w:cs="Helvetica"/>
+          <w:b/>
+          <w:bCs/>
+        </w:rPr>
+        <w:t>Funzione x</w:t>
+      </w:r>
+      <w:r>
+        <w:rPr>
+          <w:rFonts w:ascii="Helvetica" w:hAnsi="Helvetica" w:cs="Helvetica"/>
+          <w:i/>
+          <w:iCs/>
+        </w:rPr>
+        <w:t xml:space="preserve"> </w:t>
+      </w:r>
+    </w:p>
+    <w:tbl>
+      <w:tblPr>
+        <w:tblStyle w:val="Grigliatabella"/>
+        <w:tblW w:w="0" w:type="auto"/>
+        <w:tblInd w:w="2880" w:type="dxa"/>
+        <w:tblLook w:val="04A0" w:firstRow="1" w:lastRow="0" w:firstColumn="1" w:lastColumn="0" w:noHBand="0" w:noVBand="1"/>
+      </w:tblPr>
+      <w:tblGrid>
+        <w:gridCol w:w="3349"/>
+        <w:gridCol w:w="3399"/>
+      </w:tblGrid>
+      <w:tr>
+        <w:tc>
+          <w:tcPr>
+            <w:tcW w:w="4814" w:type="dxa"/>
+          </w:tcPr>
+          <w:p>
+            <w:pPr>
+              <w:pStyle w:val="NormaleWeb"/>
+              <w:rPr>
+                <w:rFonts w:ascii="Helvetica" w:hAnsi="Helvetica" w:cs="Helvetica"/>
+                <w:b/>
+                <w:bCs/>
+              </w:rPr>
+            </w:pPr>
+            <w:r>
+              <w:rPr>
+                <w:rFonts w:ascii="Helvetica" w:hAnsi="Helvetica" w:cs="Helvetica"/>
+                <w:b/>
+                <w:bCs/>
+              </w:rPr>
+              <w:t>Specifica sintattica</w:t>
+            </w:r>
+          </w:p>
+        </w:tc>
+        <w:tc>
+          <w:tcPr>
+            <w:tcW w:w="4814" w:type="dxa"/>
+          </w:tcPr>
+          <w:p>
+            <w:pPr>
+              <w:pStyle w:val="NormaleWeb"/>
+              <w:rPr>
+                <w:rFonts w:ascii="Helvetica" w:hAnsi="Helvetica" w:cs="Helvetica"/>
+                <w:b/>
+                <w:bCs/>
+              </w:rPr>
+            </w:pPr>
+            <w:r>
+              <w:rPr>
+                <w:rFonts w:ascii="Helvetica" w:hAnsi="Helvetica" w:cs="Helvetica"/>
+                <w:b/>
+                <w:bCs/>
+              </w:rPr>
+              <w:t>Specifica semantica</w:t>
+            </w:r>
+          </w:p>
+        </w:tc>
+      </w:tr>
+      <w:tr>
+        <w:tc>
+          <w:tcPr>
+            <w:tcW w:w="4814" w:type="dxa"/>
+          </w:tcPr>
+          <w:p>
+            <w:pPr>
+              <w:pStyle w:val="NormaleWeb"/>
+              <w:rPr>
+                <w:rFonts w:ascii="Helvetica" w:hAnsi="Helvetica" w:cs="Helvetica"/>
+              </w:rPr>
+            </w:pPr>
+            <w:proofErr w:type="spellStart"/>
+            <w:r>
+              <w:rPr>
+                <w:rFonts w:ascii="Helvetica" w:hAnsi="Helvetica" w:cs="Helvetica"/>
+              </w:rPr>
+              <w:t>sdfsdf</w:t>
+            </w:r>
+            <w:proofErr w:type="spellEnd"/>
+          </w:p>
+        </w:tc>
+        <w:tc>
+          <w:tcPr>
+            <w:tcW w:w="4814" w:type="dxa"/>
+          </w:tcPr>
+          <w:p>
+            <w:pPr>
+              <w:pStyle w:val="NormaleWeb"/>
+              <w:rPr>
+                <w:rFonts w:ascii="Helvetica" w:hAnsi="Helvetica" w:cs="Helvetica"/>
+              </w:rPr>
+            </w:pPr>
+            <w:proofErr w:type="spellStart"/>
+            <w:r>
+              <w:rPr>
+                <w:rFonts w:ascii="Helvetica" w:hAnsi="Helvetica" w:cs="Helvetica"/>
+              </w:rPr>
+              <w:t>sdfsdfs</w:t>
+            </w:r>
+            <w:proofErr w:type="spellEnd"/>
+          </w:p>
+        </w:tc>
+      </w:tr>
+    </w:tbl>
+    <w:p>
+      <w:pPr>
+        <w:pStyle w:val="NormaleWeb"/>
+        <w:numPr>
+          <w:ilvl w:val="2"/>
+          <w:numId w:val="3"/>
+        </w:numPr>
+        <w:rPr>
+          <w:rFonts w:ascii="Helvetica" w:hAnsi="Helvetica" w:cs="Helvetica"/>
+          <w:b/>
+          <w:bCs/>
+        </w:rPr>
+      </w:pPr>
+      <w:r>
+        <w:rPr>
+          <w:rFonts w:ascii="Helvetica" w:hAnsi="Helvetica" w:cs="Helvetica"/>
+          <w:b/>
+          <w:bCs/>
+        </w:rPr>
+        <w:t xml:space="preserve">Funzione y </w:t>
+      </w:r>
+    </w:p>
+    <w:tbl>
+      <w:tblPr>
+        <w:tblStyle w:val="Grigliatabella"/>
+        <w:tblW w:w="0" w:type="auto"/>
+        <w:tblInd w:w="2880" w:type="dxa"/>
+        <w:tblLook w:val="04A0" w:firstRow="1" w:lastRow="0" w:firstColumn="1" w:lastColumn="0" w:noHBand="0" w:noVBand="1"/>
+      </w:tblPr>
+      <w:tblGrid>
+        <w:gridCol w:w="3349"/>
+        <w:gridCol w:w="3399"/>
+      </w:tblGrid>
+      <w:tr>
+        <w:tc>
+          <w:tcPr>
+            <w:tcW w:w="4814" w:type="dxa"/>
+          </w:tcPr>
+          <w:p>
+            <w:pPr>
+              <w:pStyle w:val="NormaleWeb"/>
+              <w:rPr>
+                <w:rFonts w:ascii="Helvetica" w:hAnsi="Helvetica" w:cs="Helvetica"/>
+                <w:b/>
+                <w:bCs/>
+              </w:rPr>
+            </w:pPr>
+            <w:r>
+              <w:rPr>
+                <w:rFonts w:ascii="Helvetica" w:hAnsi="Helvetica" w:cs="Helvetica"/>
+                <w:b/>
+                <w:bCs/>
+              </w:rPr>
+              <w:t>Specifica sintattica</w:t>
+            </w:r>
+          </w:p>
+        </w:tc>
+        <w:tc>
+          <w:tcPr>
+            <w:tcW w:w="4814" w:type="dxa"/>
+          </w:tcPr>
+          <w:p>
+            <w:pPr>
+              <w:pStyle w:val="NormaleWeb"/>
+              <w:rPr>
+                <w:rFonts w:ascii="Helvetica" w:hAnsi="Helvetica" w:cs="Helvetica"/>
+                <w:b/>
+                <w:bCs/>
+              </w:rPr>
+            </w:pPr>
+            <w:r>
+              <w:rPr>
+                <w:rFonts w:ascii="Helvetica" w:hAnsi="Helvetica" w:cs="Helvetica"/>
+                <w:b/>
+                <w:bCs/>
+              </w:rPr>
+              <w:t>Specifica semantica</w:t>
+            </w:r>
+          </w:p>
+        </w:tc>
+      </w:tr>
+      <w:tr>
+        <w:tc>
+          <w:tcPr>
+            <w:tcW w:w="4814" w:type="dxa"/>
+          </w:tcPr>
+          <w:p>
+            <w:pPr>
+              <w:pStyle w:val="NormaleWeb"/>
+              <w:rPr>
+                <w:rFonts w:ascii="Helvetica" w:hAnsi="Helvetica" w:cs="Helvetica"/>
+              </w:rPr>
+            </w:pPr>
+            <w:proofErr w:type="spellStart"/>
+            <w:r>
+              <w:rPr>
+                <w:rFonts w:ascii="Helvetica" w:hAnsi="Helvetica" w:cs="Helvetica"/>
+              </w:rPr>
+              <w:t>sdfsdf</w:t>
+            </w:r>
+            <w:proofErr w:type="spellEnd"/>
+          </w:p>
+        </w:tc>
+        <w:tc>
+          <w:tcPr>
+            <w:tcW w:w="4814" w:type="dxa"/>
+          </w:tcPr>
+          <w:p>
+            <w:pPr>
+              <w:pStyle w:val="NormaleWeb"/>
+              <w:rPr>
+                <w:rFonts w:ascii="Helvetica" w:hAnsi="Helvetica" w:cs="Helvetica"/>
+              </w:rPr>
+            </w:pPr>
+            <w:proofErr w:type="spellStart"/>
+            <w:r>
+              <w:rPr>
+                <w:rFonts w:ascii="Helvetica" w:hAnsi="Helvetica" w:cs="Helvetica"/>
+              </w:rPr>
+              <w:t>sdfsdfs</w:t>
+            </w:r>
+            <w:proofErr w:type="spellEnd"/>
+          </w:p>
+        </w:tc>
+      </w:tr>
+    </w:tbl>
+    <w:p>
+      <w:pPr>
+        <w:pStyle w:val="NormaleWeb"/>
+        <w:rPr>
+          <w:rFonts w:ascii="Helvetica" w:hAnsi="Helvetica" w:cs="Helvetica"/>
+        </w:rPr>
+      </w:pPr>
     </w:p>
     <w:p>
       <w:pPr>
@@ -37,7 +1221,7 @@
           <w:sz w:val="24"/>
           <w:szCs w:val="24"/>
         </w:rPr>
-        <w:t>Motivazione ADT</w:t>
+        <w:t>Progettazione</w:t>
       </w:r>
     </w:p>
     <w:p>
@@ -50,106 +1234,6 @@
           <w:szCs w:val="24"/>
         </w:rPr>
       </w:pPr>
-    </w:p>
-    <w:p>
-      <w:pPr>
-        <w:spacing w:line="276" w:lineRule="auto"/>
-        <w:jc w:val="both"/>
-        <w:rPr>
-          <w:rFonts w:ascii="Helvetica Rounded" w:hAnsi="Helvetica Rounded" w:cs="Helvetica"/>
-          <w:sz w:val="24"/>
-          <w:szCs w:val="24"/>
-        </w:rPr>
-      </w:pPr>
-      <w:r>
-        <w:rPr>
-          <w:rFonts w:ascii="Helvetica Rounded" w:hAnsi="Helvetica Rounded" w:cs="Helvetica"/>
-          <w:sz w:val="24"/>
-          <w:szCs w:val="24"/>
-        </w:rPr>
-        <w:t>Progettazione</w:t>
-      </w:r>
-    </w:p>
-    <w:p>
-      <w:pPr>
-        <w:spacing w:line="276" w:lineRule="auto"/>
-        <w:jc w:val="both"/>
-        <w:rPr>
-          <w:rFonts w:ascii="Helvetica Rounded" w:hAnsi="Helvetica Rounded" w:cs="Helvetica"/>
-          <w:sz w:val="24"/>
-          <w:szCs w:val="24"/>
-        </w:rPr>
-      </w:pPr>
-    </w:p>
-    <w:p>
-      <w:pPr>
-        <w:spacing w:line="276" w:lineRule="auto"/>
-        <w:jc w:val="both"/>
-        <w:rPr>
-          <w:rFonts w:ascii="Helvetica Rounded" w:hAnsi="Helvetica Rounded" w:cs="Helvetica"/>
-          <w:sz w:val="24"/>
-          <w:szCs w:val="24"/>
-        </w:rPr>
-      </w:pPr>
-      <w:r>
-        <w:rPr>
-          <w:rFonts w:ascii="Helvetica Rounded" w:hAnsi="Helvetica Rounded" w:cs="Helvetica"/>
-          <w:sz w:val="24"/>
-          <w:szCs w:val="24"/>
-        </w:rPr>
-        <w:t>Specifica Sintattica</w:t>
-      </w:r>
-    </w:p>
-    <w:p>
-      <w:pPr>
-        <w:spacing w:line="276" w:lineRule="auto"/>
-        <w:jc w:val="both"/>
-        <w:rPr>
-          <w:rFonts w:ascii="Helvetica Rounded" w:hAnsi="Helvetica Rounded" w:cs="Helvetica"/>
-          <w:sz w:val="24"/>
-          <w:szCs w:val="24"/>
-        </w:rPr>
-      </w:pPr>
-      <w:bookmarkStart w:id="0" w:name="_GoBack"/>
-      <w:bookmarkEnd w:id="0"/>
-    </w:p>
-    <w:p>
-      <w:pPr>
-        <w:spacing w:line="276" w:lineRule="auto"/>
-        <w:jc w:val="both"/>
-        <w:rPr>
-          <w:rFonts w:ascii="Helvetica Rounded" w:hAnsi="Helvetica Rounded" w:cs="Helvetica"/>
-          <w:sz w:val="24"/>
-          <w:szCs w:val="24"/>
-        </w:rPr>
-      </w:pPr>
-      <w:r>
-        <w:rPr>
-          <w:rFonts w:ascii="Helvetica Rounded" w:hAnsi="Helvetica Rounded" w:cs="Helvetica"/>
-          <w:sz w:val="24"/>
-          <w:szCs w:val="24"/>
-        </w:rPr>
-        <w:t>Specifica Semantica</w:t>
-      </w:r>
-    </w:p>
-    <w:p>
-      <w:pPr>
-        <w:spacing w:line="276" w:lineRule="auto"/>
-        <w:jc w:val="both"/>
-        <w:rPr>
-          <w:rFonts w:ascii="Helvetica" w:hAnsi="Helvetica" w:cs="Helvetica"/>
-          <w:sz w:val="24"/>
-          <w:szCs w:val="24"/>
-        </w:rPr>
-      </w:pPr>
-      <w:r>
-        <w:rPr>
-          <w:rFonts w:ascii="Helvetica" w:hAnsi="Helvetica" w:cs="Helvetica"/>
-          <w:sz w:val="24"/>
-          <w:szCs w:val="24"/>
-        </w:rPr>
-        <w:t>Razionale??casi di test</w:t>
-      </w:r>
     </w:p>
     <w:p>
       <w:pPr>
@@ -182,8 +1266,234 @@
 </file>
 
 <file path=word/numbering.xml><?xml version="1.0" encoding="utf-8"?>
-<w:numbering xmlns:wpc="http://schemas.microsoft.com/office/word/2010/wordprocessingCanvas" xmlns:cx="http://schemas.microsoft.com/office/drawing/2014/chartex" xmlns:mc="http://schemas.openxmlformats.org/markup-compatibility/2006" xmlns:o="urn:schemas-microsoft-com:office:office" xmlns:r="http://schemas.openxmlformats.org/officeDocument/2006/relationships" xmlns:m="http://schemas.openxmlformats.org/officeDocument/2006/math" xmlns:v="urn:schemas-microsoft-com:vml" xmlns:wp14="http://schemas.microsoft.com/office/word/2010/wordprocessingDrawing" xmlns:wp="http://schemas.openxmlformats.org/drawingml/2006/wordprocessingDrawing" xmlns:w10="urn:schemas-microsoft-com:office:word" xmlns:w="http://schemas.openxmlformats.org/wordprocessingml/2006/main" xmlns:w14="http://schemas.microsoft.com/office/word/2010/wordml" xmlns:w15="http://schemas.microsoft.com/office/word/2012/wordml" xmlns:w16se="http://schemas.microsoft.com/office/word/2015/wordml/symex" xmlns:wpg="http://schemas.microsoft.com/office/word/2010/wordprocessingGroup" xmlns:wpi="http://schemas.microsoft.com/office/word/2010/wordprocessingInk" xmlns:wne="http://schemas.microsoft.com/office/word/2006/wordml" xmlns:wps="http://schemas.microsoft.com/office/word/2010/wordprocessingShape" mc:Ignorable="w14 w15 w16se wp14">
+<w:numbering xmlns:wpc="http://schemas.microsoft.com/office/word/2010/wordprocessingCanvas" xmlns:cx="http://schemas.microsoft.com/office/drawing/2014/chartex" xmlns:cx1="http://schemas.microsoft.com/office/drawing/2015/9/8/chartex" xmlns:cx2="http://schemas.microsoft.com/office/drawing/2015/10/21/chartex" xmlns:cx3="http://schemas.microsoft.com/office/drawing/2016/5/9/chartex" xmlns:cx4="http://schemas.microsoft.com/office/drawing/2016/5/10/chartex" xmlns:cx5="http://schemas.microsoft.com/office/drawing/2016/5/11/chartex" xmlns:cx6="http://schemas.microsoft.com/office/drawing/2016/5/12/chartex" xmlns:cx7="http://schemas.microsoft.com/office/drawing/2016/5/13/chartex" xmlns:cx8="http://schemas.microsoft.com/office/drawing/2016/5/14/chartex" xmlns:mc="http://schemas.openxmlformats.org/markup-compatibility/2006" xmlns:aink="http://schemas.microsoft.com/office/drawing/2016/ink" xmlns:am3d="http://schemas.microsoft.com/office/drawing/2017/model3d" xmlns:o="urn:schemas-microsoft-com:office:office" xmlns:oel="http://schemas.microsoft.com/office/2019/extlst" xmlns:r="http://schemas.openxmlformats.org/officeDocument/2006/relationships" xmlns:m="http://schemas.openxmlformats.org/officeDocument/2006/math" xmlns:v="urn:schemas-microsoft-com:vml" xmlns:wp14="http://schemas.microsoft.com/office/word/2010/wordprocessingDrawing" xmlns:wp="http://schemas.openxmlformats.org/drawingml/2006/wordprocessingDrawing" xmlns:w10="urn:schemas-microsoft-com:office:word" xmlns:w="http://schemas.openxmlformats.org/wordprocessingml/2006/main" xmlns:w14="http://schemas.microsoft.com/office/word/2010/wordml" xmlns:w15="http://schemas.microsoft.com/office/word/2012/wordml" xmlns:w16cex="http://schemas.microsoft.com/office/word/2018/wordml/cex" xmlns:w16cid="http://schemas.microsoft.com/office/word/2016/wordml/cid" xmlns:w16="http://schemas.microsoft.com/office/word/2018/wordml" xmlns:w16du="http://schemas.microsoft.com/office/word/2023/wordml/word16du" xmlns:w16sdtdh="http://schemas.microsoft.com/office/word/2020/wordml/sdtdatahash" xmlns:w16sdtfl="http://schemas.microsoft.com/office/word/2024/wordml/sdtformatlock" xmlns:w16se="http://schemas.microsoft.com/office/word/2015/wordml/symex" xmlns:wpg="http://schemas.microsoft.com/office/word/2010/wordprocessingGroup" xmlns:wpi="http://schemas.microsoft.com/office/word/2010/wordprocessingInk" xmlns:wne="http://schemas.microsoft.com/office/word/2006/wordml" xmlns:wps="http://schemas.microsoft.com/office/word/2010/wordprocessingShape" mc:Ignorable="w14 w15 w16se w16cid w16 w16cex w16sdtdh w16sdtfl w16du wp14">
   <w:abstractNum w:abstractNumId="0" w15:restartNumberingAfterBreak="0">
+    <w:nsid w:val="2D6B2CC9"/>
+    <w:multiLevelType w:val="hybridMultilevel"/>
+    <w:tmpl w:val="8A708EEC"/>
+    <w:lvl w:ilvl="0" w:tplc="04100001">
+      <w:start w:val="1"/>
+      <w:numFmt w:val="bullet"/>
+      <w:lvlText w:val=""/>
+      <w:lvlJc w:val="left"/>
+      <w:pPr>
+        <w:ind w:left="720" w:hanging="360"/>
+      </w:pPr>
+      <w:rPr>
+        <w:rFonts w:ascii="Symbol" w:hAnsi="Symbol" w:hint="default"/>
+      </w:rPr>
+    </w:lvl>
+    <w:lvl w:ilvl="1" w:tplc="04100003">
+      <w:start w:val="1"/>
+      <w:numFmt w:val="bullet"/>
+      <w:lvlText w:val="o"/>
+      <w:lvlJc w:val="left"/>
+      <w:pPr>
+        <w:ind w:left="1440" w:hanging="360"/>
+      </w:pPr>
+      <w:rPr>
+        <w:rFonts w:ascii="Courier New" w:hAnsi="Courier New" w:cs="Courier New" w:hint="default"/>
+      </w:rPr>
+    </w:lvl>
+    <w:lvl w:ilvl="2" w:tplc="04100005" w:tentative="1">
+      <w:start w:val="1"/>
+      <w:numFmt w:val="bullet"/>
+      <w:lvlText w:val=""/>
+      <w:lvlJc w:val="left"/>
+      <w:pPr>
+        <w:ind w:left="2160" w:hanging="360"/>
+      </w:pPr>
+      <w:rPr>
+        <w:rFonts w:ascii="Wingdings" w:hAnsi="Wingdings" w:hint="default"/>
+      </w:rPr>
+    </w:lvl>
+    <w:lvl w:ilvl="3" w:tplc="04100001" w:tentative="1">
+      <w:start w:val="1"/>
+      <w:numFmt w:val="bullet"/>
+      <w:lvlText w:val=""/>
+      <w:lvlJc w:val="left"/>
+      <w:pPr>
+        <w:ind w:left="2880" w:hanging="360"/>
+      </w:pPr>
+      <w:rPr>
+        <w:rFonts w:ascii="Symbol" w:hAnsi="Symbol" w:hint="default"/>
+      </w:rPr>
+    </w:lvl>
+    <w:lvl w:ilvl="4" w:tplc="04100003" w:tentative="1">
+      <w:start w:val="1"/>
+      <w:numFmt w:val="bullet"/>
+      <w:lvlText w:val="o"/>
+      <w:lvlJc w:val="left"/>
+      <w:pPr>
+        <w:ind w:left="3600" w:hanging="360"/>
+      </w:pPr>
+      <w:rPr>
+        <w:rFonts w:ascii="Courier New" w:hAnsi="Courier New" w:cs="Courier New" w:hint="default"/>
+      </w:rPr>
+    </w:lvl>
+    <w:lvl w:ilvl="5" w:tplc="04100005" w:tentative="1">
+      <w:start w:val="1"/>
+      <w:numFmt w:val="bullet"/>
+      <w:lvlText w:val=""/>
+      <w:lvlJc w:val="left"/>
+      <w:pPr>
+        <w:ind w:left="4320" w:hanging="360"/>
+      </w:pPr>
+      <w:rPr>
+        <w:rFonts w:ascii="Wingdings" w:hAnsi="Wingdings" w:hint="default"/>
+      </w:rPr>
+    </w:lvl>
+    <w:lvl w:ilvl="6" w:tplc="04100001" w:tentative="1">
+      <w:start w:val="1"/>
+      <w:numFmt w:val="bullet"/>
+      <w:lvlText w:val=""/>
+      <w:lvlJc w:val="left"/>
+      <w:pPr>
+        <w:ind w:left="5040" w:hanging="360"/>
+      </w:pPr>
+      <w:rPr>
+        <w:rFonts w:ascii="Symbol" w:hAnsi="Symbol" w:hint="default"/>
+      </w:rPr>
+    </w:lvl>
+    <w:lvl w:ilvl="7" w:tplc="04100003" w:tentative="1">
+      <w:start w:val="1"/>
+      <w:numFmt w:val="bullet"/>
+      <w:lvlText w:val="o"/>
+      <w:lvlJc w:val="left"/>
+      <w:pPr>
+        <w:ind w:left="5760" w:hanging="360"/>
+      </w:pPr>
+      <w:rPr>
+        <w:rFonts w:ascii="Courier New" w:hAnsi="Courier New" w:cs="Courier New" w:hint="default"/>
+      </w:rPr>
+    </w:lvl>
+    <w:lvl w:ilvl="8" w:tplc="04100005" w:tentative="1">
+      <w:start w:val="1"/>
+      <w:numFmt w:val="bullet"/>
+      <w:lvlText w:val=""/>
+      <w:lvlJc w:val="left"/>
+      <w:pPr>
+        <w:ind w:left="6480" w:hanging="360"/>
+      </w:pPr>
+      <w:rPr>
+        <w:rFonts w:ascii="Wingdings" w:hAnsi="Wingdings" w:hint="default"/>
+      </w:rPr>
+    </w:lvl>
+  </w:abstractNum>
+  <w:abstractNum w:abstractNumId="1" w15:restartNumberingAfterBreak="0">
+    <w:nsid w:val="4DA90502"/>
+    <w:multiLevelType w:val="hybridMultilevel"/>
+    <w:tmpl w:val="BBB47D68"/>
+    <w:lvl w:ilvl="0" w:tplc="04100001">
+      <w:start w:val="1"/>
+      <w:numFmt w:val="bullet"/>
+      <w:lvlText w:val=""/>
+      <w:lvlJc w:val="left"/>
+      <w:pPr>
+        <w:ind w:left="720" w:hanging="360"/>
+      </w:pPr>
+      <w:rPr>
+        <w:rFonts w:ascii="Symbol" w:hAnsi="Symbol" w:hint="default"/>
+      </w:rPr>
+    </w:lvl>
+    <w:lvl w:ilvl="1" w:tplc="04100003">
+      <w:start w:val="1"/>
+      <w:numFmt w:val="bullet"/>
+      <w:lvlText w:val="o"/>
+      <w:lvlJc w:val="left"/>
+      <w:pPr>
+        <w:ind w:left="1440" w:hanging="360"/>
+      </w:pPr>
+      <w:rPr>
+        <w:rFonts w:ascii="Courier New" w:hAnsi="Courier New" w:cs="Courier New" w:hint="default"/>
+      </w:rPr>
+    </w:lvl>
+    <w:lvl w:ilvl="2" w:tplc="04100005">
+      <w:start w:val="1"/>
+      <w:numFmt w:val="bullet"/>
+      <w:lvlText w:val=""/>
+      <w:lvlJc w:val="left"/>
+      <w:pPr>
+        <w:ind w:left="2160" w:hanging="360"/>
+      </w:pPr>
+      <w:rPr>
+        <w:rFonts w:ascii="Wingdings" w:hAnsi="Wingdings" w:hint="default"/>
+      </w:rPr>
+    </w:lvl>
+    <w:lvl w:ilvl="3" w:tplc="04100001">
+      <w:start w:val="1"/>
+      <w:numFmt w:val="bullet"/>
+      <w:lvlText w:val=""/>
+      <w:lvlJc w:val="left"/>
+      <w:pPr>
+        <w:ind w:left="2880" w:hanging="360"/>
+      </w:pPr>
+      <w:rPr>
+        <w:rFonts w:ascii="Symbol" w:hAnsi="Symbol" w:hint="default"/>
+      </w:rPr>
+    </w:lvl>
+    <w:lvl w:ilvl="4" w:tplc="04100003">
+      <w:start w:val="1"/>
+      <w:numFmt w:val="bullet"/>
+      <w:lvlText w:val="o"/>
+      <w:lvlJc w:val="left"/>
+      <w:pPr>
+        <w:ind w:left="3600" w:hanging="360"/>
+      </w:pPr>
+      <w:rPr>
+        <w:rFonts w:ascii="Courier New" w:hAnsi="Courier New" w:cs="Courier New" w:hint="default"/>
+      </w:rPr>
+    </w:lvl>
+    <w:lvl w:ilvl="5" w:tplc="04100005" w:tentative="1">
+      <w:start w:val="1"/>
+      <w:numFmt w:val="bullet"/>
+      <w:lvlText w:val=""/>
+      <w:lvlJc w:val="left"/>
+      <w:pPr>
+        <w:ind w:left="4320" w:hanging="360"/>
+      </w:pPr>
+      <w:rPr>
+        <w:rFonts w:ascii="Wingdings" w:hAnsi="Wingdings" w:hint="default"/>
+      </w:rPr>
+    </w:lvl>
+    <w:lvl w:ilvl="6" w:tplc="04100001" w:tentative="1">
+      <w:start w:val="1"/>
+      <w:numFmt w:val="bullet"/>
+      <w:lvlText w:val=""/>
+      <w:lvlJc w:val="left"/>
+      <w:pPr>
+        <w:ind w:left="5040" w:hanging="360"/>
+      </w:pPr>
+      <w:rPr>
+        <w:rFonts w:ascii="Symbol" w:hAnsi="Symbol" w:hint="default"/>
+      </w:rPr>
+    </w:lvl>
+    <w:lvl w:ilvl="7" w:tplc="04100003" w:tentative="1">
+      <w:start w:val="1"/>
+      <w:numFmt w:val="bullet"/>
+      <w:lvlText w:val="o"/>
+      <w:lvlJc w:val="left"/>
+      <w:pPr>
+        <w:ind w:left="5760" w:hanging="360"/>
+      </w:pPr>
+      <w:rPr>
+        <w:rFonts w:ascii="Courier New" w:hAnsi="Courier New" w:cs="Courier New" w:hint="default"/>
+      </w:rPr>
+    </w:lvl>
+    <w:lvl w:ilvl="8" w:tplc="04100005" w:tentative="1">
+      <w:start w:val="1"/>
+      <w:numFmt w:val="bullet"/>
+      <w:lvlText w:val=""/>
+      <w:lvlJc w:val="left"/>
+      <w:pPr>
+        <w:ind w:left="6480" w:hanging="360"/>
+      </w:pPr>
+      <w:rPr>
+        <w:rFonts w:ascii="Wingdings" w:hAnsi="Wingdings" w:hint="default"/>
+      </w:rPr>
+    </w:lvl>
+  </w:abstractNum>
+  <w:abstractNum w:abstractNumId="2" w15:restartNumberingAfterBreak="0">
     <w:nsid w:val="5E257C8D"/>
     <w:multiLevelType w:val="hybridMultilevel"/>
     <w:tmpl w:val="FEA2336A"/>
@@ -296,14 +1606,20 @@
       </w:rPr>
     </w:lvl>
   </w:abstractNum>
-  <w:num w:numId="1">
+  <w:num w:numId="1" w16cid:durableId="175778143">
+    <w:abstractNumId w:val="2"/>
+  </w:num>
+  <w:num w:numId="2" w16cid:durableId="1701584318">
     <w:abstractNumId w:val="0"/>
+  </w:num>
+  <w:num w:numId="3" w16cid:durableId="2104255422">
+    <w:abstractNumId w:val="1"/>
   </w:num>
 </w:numbering>
 </file>
 
 <file path=word/styles.xml><?xml version="1.0" encoding="utf-8"?>
-<w:styles xmlns:mc="http://schemas.openxmlformats.org/markup-compatibility/2006" xmlns:r="http://schemas.openxmlformats.org/officeDocument/2006/relationships" xmlns:w="http://schemas.openxmlformats.org/wordprocessingml/2006/main" xmlns:w14="http://schemas.microsoft.com/office/word/2010/wordml" xmlns:w15="http://schemas.microsoft.com/office/word/2012/wordml" xmlns:w16se="http://schemas.microsoft.com/office/word/2015/wordml/symex" mc:Ignorable="w14 w15 w16se">
+<w:styles xmlns:mc="http://schemas.openxmlformats.org/markup-compatibility/2006" xmlns:r="http://schemas.openxmlformats.org/officeDocument/2006/relationships" xmlns:w="http://schemas.openxmlformats.org/wordprocessingml/2006/main" xmlns:w14="http://schemas.microsoft.com/office/word/2010/wordml" xmlns:w15="http://schemas.microsoft.com/office/word/2012/wordml" xmlns:w16cex="http://schemas.microsoft.com/office/word/2018/wordml/cex" xmlns:w16cid="http://schemas.microsoft.com/office/word/2016/wordml/cid" xmlns:w16="http://schemas.microsoft.com/office/word/2018/wordml" xmlns:w16du="http://schemas.microsoft.com/office/word/2023/wordml/word16du" xmlns:w16sdtdh="http://schemas.microsoft.com/office/word/2020/wordml/sdtdatahash" xmlns:w16sdtfl="http://schemas.microsoft.com/office/word/2024/wordml/sdtformatlock" xmlns:w16se="http://schemas.microsoft.com/office/word/2015/wordml/symex" mc:Ignorable="w14 w15 w16se w16cid w16 w16cex w16sdtdh w16sdtfl w16du">
   <w:docDefaults>
     <w:rPrDefault>
       <w:rPr>
@@ -319,7 +1635,7 @@
       </w:pPr>
     </w:pPrDefault>
   </w:docDefaults>
-  <w:latentStyles w:defLockedState="0" w:defUIPriority="99" w:defSemiHidden="0" w:defUnhideWhenUsed="0" w:defQFormat="0" w:count="371">
+  <w:latentStyles w:defLockedState="0" w:defUIPriority="99" w:defSemiHidden="0" w:defUnhideWhenUsed="0" w:defQFormat="0" w:count="376">
     <w:lsdException w:name="Normal" w:uiPriority="0" w:qFormat="1"/>
     <w:lsdException w:name="heading 1" w:uiPriority="9" w:qFormat="1"/>
     <w:lsdException w:name="heading 2" w:semiHidden="1" w:uiPriority="9" w:unhideWhenUsed="1" w:qFormat="1"/>
@@ -691,10 +2007,37 @@
     <w:lsdException w:name="List Table 5 Dark Accent 6" w:uiPriority="50"/>
     <w:lsdException w:name="List Table 6 Colorful Accent 6" w:uiPriority="51"/>
     <w:lsdException w:name="List Table 7 Colorful Accent 6" w:uiPriority="52"/>
+    <w:lsdException w:name="Mention" w:semiHidden="1" w:unhideWhenUsed="1"/>
+    <w:lsdException w:name="Smart Hyperlink" w:semiHidden="1" w:unhideWhenUsed="1"/>
+    <w:lsdException w:name="Hashtag" w:semiHidden="1" w:unhideWhenUsed="1"/>
+    <w:lsdException w:name="Unresolved Mention" w:semiHidden="1" w:unhideWhenUsed="1"/>
+    <w:lsdException w:name="Smart Link" w:semiHidden="1" w:unhideWhenUsed="1"/>
   </w:latentStyles>
   <w:style w:type="paragraph" w:default="1" w:styleId="Normale">
     <w:name w:val="Normal"/>
     <w:qFormat/>
+    <w:rsid w:val="00CB173B"/>
+  </w:style>
+  <w:style w:type="paragraph" w:styleId="Titolo1">
+    <w:name w:val="heading 1"/>
+    <w:basedOn w:val="Normale"/>
+    <w:next w:val="Normale"/>
+    <w:link w:val="Titolo1Carattere"/>
+    <w:uiPriority w:val="9"/>
+    <w:qFormat/>
+    <w:rsid w:val="00651A34"/>
+    <w:pPr>
+      <w:keepNext/>
+      <w:keepLines/>
+      <w:spacing w:before="240" w:after="0"/>
+      <w:outlineLvl w:val="0"/>
+    </w:pPr>
+    <w:rPr>
+      <w:rFonts w:asciiTheme="majorHAnsi" w:eastAsiaTheme="majorEastAsia" w:hAnsiTheme="majorHAnsi" w:cstheme="majorBidi"/>
+      <w:color w:val="2F5496" w:themeColor="accent1" w:themeShade="BF"/>
+      <w:sz w:val="32"/>
+      <w:szCs w:val="32"/>
+    </w:rPr>
   </w:style>
   <w:style w:type="character" w:default="1" w:styleId="Carpredefinitoparagrafo">
     <w:name w:val="Default Paragraph Font"/>
@@ -734,6 +2077,94 @@
       <w:contextualSpacing/>
     </w:pPr>
   </w:style>
+  <w:style w:type="character" w:customStyle="1" w:styleId="Titolo1Carattere">
+    <w:name w:val="Titolo 1 Carattere"/>
+    <w:basedOn w:val="Carpredefinitoparagrafo"/>
+    <w:link w:val="Titolo1"/>
+    <w:uiPriority w:val="9"/>
+    <w:rsid w:val="00651A34"/>
+    <w:rPr>
+      <w:rFonts w:asciiTheme="majorHAnsi" w:eastAsiaTheme="majorEastAsia" w:hAnsiTheme="majorHAnsi" w:cstheme="majorBidi"/>
+      <w:color w:val="2F5496" w:themeColor="accent1" w:themeShade="BF"/>
+      <w:sz w:val="32"/>
+      <w:szCs w:val="32"/>
+    </w:rPr>
+  </w:style>
+  <w:style w:type="paragraph" w:styleId="NormaleWeb">
+    <w:name w:val="Normal (Web)"/>
+    <w:basedOn w:val="Normale"/>
+    <w:uiPriority w:val="99"/>
+    <w:unhideWhenUsed/>
+    <w:rsid w:val="00651A34"/>
+    <w:pPr>
+      <w:spacing w:before="100" w:beforeAutospacing="1" w:after="100" w:afterAutospacing="1" w:line="240" w:lineRule="auto"/>
+    </w:pPr>
+    <w:rPr>
+      <w:rFonts w:ascii="Times New Roman" w:eastAsia="Times New Roman" w:hAnsi="Times New Roman" w:cs="Times New Roman"/>
+      <w:sz w:val="24"/>
+      <w:szCs w:val="24"/>
+      <w:lang w:eastAsia="it-IT"/>
+    </w:rPr>
+  </w:style>
+  <w:style w:type="character" w:styleId="CodiceHTML">
+    <w:name w:val="HTML Code"/>
+    <w:basedOn w:val="Carpredefinitoparagrafo"/>
+    <w:uiPriority w:val="99"/>
+    <w:semiHidden/>
+    <w:unhideWhenUsed/>
+    <w:rsid w:val="00651A34"/>
+    <w:rPr>
+      <w:rFonts w:ascii="Courier New" w:eastAsia="Times New Roman" w:hAnsi="Courier New" w:cs="Courier New"/>
+      <w:sz w:val="20"/>
+      <w:szCs w:val="20"/>
+    </w:rPr>
+  </w:style>
+  <w:style w:type="character" w:styleId="Enfasigrassetto">
+    <w:name w:val="Strong"/>
+    <w:basedOn w:val="Carpredefinitoparagrafo"/>
+    <w:uiPriority w:val="22"/>
+    <w:qFormat/>
+    <w:rsid w:val="00651A34"/>
+    <w:rPr>
+      <w:b/>
+      <w:bCs/>
+    </w:rPr>
+  </w:style>
+  <w:style w:type="character" w:customStyle="1" w:styleId="math">
+    <w:name w:val="math"/>
+    <w:basedOn w:val="Carpredefinitoparagrafo"/>
+    <w:rsid w:val="00651A34"/>
+  </w:style>
+  <w:style w:type="character" w:styleId="Enfasicorsivo">
+    <w:name w:val="Emphasis"/>
+    <w:basedOn w:val="Carpredefinitoparagrafo"/>
+    <w:uiPriority w:val="20"/>
+    <w:qFormat/>
+    <w:rsid w:val="00BE0D44"/>
+    <w:rPr>
+      <w:i/>
+      <w:iCs/>
+    </w:rPr>
+  </w:style>
+  <w:style w:type="table" w:styleId="Grigliatabella">
+    <w:name w:val="Table Grid"/>
+    <w:basedOn w:val="Tabellanormale"/>
+    <w:uiPriority w:val="39"/>
+    <w:rsid w:val="00CB173B"/>
+    <w:pPr>
+      <w:spacing w:after="0" w:line="240" w:lineRule="auto"/>
+    </w:pPr>
+    <w:tblPr>
+      <w:tblBorders>
+        <w:top w:val="single" w:sz="4" w:space="0" w:color="auto"/>
+        <w:left w:val="single" w:sz="4" w:space="0" w:color="auto"/>
+        <w:bottom w:val="single" w:sz="4" w:space="0" w:color="auto"/>
+        <w:right w:val="single" w:sz="4" w:space="0" w:color="auto"/>
+        <w:insideH w:val="single" w:sz="4" w:space="0" w:color="auto"/>
+        <w:insideV w:val="single" w:sz="4" w:space="0" w:color="auto"/>
+      </w:tblBorders>
+    </w:tblPr>
+  </w:style>
 </w:styles>
 </file>
 
@@ -742,10 +2173,10 @@
   <a:themeElements>
     <a:clrScheme name="Office">
       <a:dk1>
-        <a:sysClr val="windowText" lastClr="000000"/>
+        <a:sysClr val="windowText" lastClr="C6C6C6"/>
       </a:dk1>
       <a:lt1>
-        <a:sysClr val="window" lastClr="FFFFFF"/>
+        <a:sysClr val="window" lastClr="000000"/>
       </a:lt1>
       <a:dk2>
         <a:srgbClr val="44546A"/>

</xml_diff>

<commit_message>
Modificato dei commenti nei file.c e il report
</commit_message>
<xml_diff>
--- a/Report.docx
+++ b/Report.docx
@@ -1,6 +1,6 @@
 
 <file path=word/document.xml><?xml version="1.0" encoding="utf-8"?>
-<w:document xmlns:wpc="http://schemas.microsoft.com/office/word/2010/wordprocessingCanvas" xmlns:cx="http://schemas.microsoft.com/office/drawing/2014/chartex" xmlns:cx1="http://schemas.microsoft.com/office/drawing/2015/9/8/chartex" xmlns:cx2="http://schemas.microsoft.com/office/drawing/2015/10/21/chartex" xmlns:cx3="http://schemas.microsoft.com/office/drawing/2016/5/9/chartex" xmlns:cx4="http://schemas.microsoft.com/office/drawing/2016/5/10/chartex" xmlns:cx5="http://schemas.microsoft.com/office/drawing/2016/5/11/chartex" xmlns:cx6="http://schemas.microsoft.com/office/drawing/2016/5/12/chartex" xmlns:cx7="http://schemas.microsoft.com/office/drawing/2016/5/13/chartex" xmlns:cx8="http://schemas.microsoft.com/office/drawing/2016/5/14/chartex" xmlns:mc="http://schemas.openxmlformats.org/markup-compatibility/2006" xmlns:aink="http://schemas.microsoft.com/office/drawing/2016/ink" xmlns:am3d="http://schemas.microsoft.com/office/drawing/2017/model3d" xmlns:o="urn:schemas-microsoft-com:office:office" xmlns:oel="http://schemas.microsoft.com/office/2019/extlst" xmlns:r="http://schemas.openxmlformats.org/officeDocument/2006/relationships" xmlns:m="http://schemas.openxmlformats.org/officeDocument/2006/math" xmlns:v="urn:schemas-microsoft-com:vml" xmlns:wp14="http://schemas.microsoft.com/office/word/2010/wordprocessingDrawing" xmlns:wp="http://schemas.openxmlformats.org/drawingml/2006/wordprocessingDrawing" xmlns:w10="urn:schemas-microsoft-com:office:word" xmlns:w="http://schemas.openxmlformats.org/wordprocessingml/2006/main" xmlns:w14="http://schemas.microsoft.com/office/word/2010/wordml" xmlns:w15="http://schemas.microsoft.com/office/word/2012/wordml" xmlns:w16cex="http://schemas.microsoft.com/office/word/2018/wordml/cex" xmlns:w16cid="http://schemas.microsoft.com/office/word/2016/wordml/cid" xmlns:w16="http://schemas.microsoft.com/office/word/2018/wordml" xmlns:w16du="http://schemas.microsoft.com/office/word/2023/wordml/word16du" xmlns:w16sdtdh="http://schemas.microsoft.com/office/word/2020/wordml/sdtdatahash" xmlns:w16sdtfl="http://schemas.microsoft.com/office/word/2024/wordml/sdtformatlock" xmlns:w16se="http://schemas.microsoft.com/office/word/2015/wordml/symex" xmlns:wpg="http://schemas.microsoft.com/office/word/2010/wordprocessingGroup" xmlns:wpi="http://schemas.microsoft.com/office/word/2010/wordprocessingInk" xmlns:wne="http://schemas.microsoft.com/office/word/2006/wordml" xmlns:wps="http://schemas.microsoft.com/office/word/2010/wordprocessingShape" mc:Ignorable="w14 w15 w16se w16cid w16 w16cex w16sdtdh w16sdtfl w16du wp14">
+<w:document xmlns:wpc="http://schemas.microsoft.com/office/word/2010/wordprocessingCanvas" xmlns:cx="http://schemas.microsoft.com/office/drawing/2014/chartex" xmlns:mc="http://schemas.openxmlformats.org/markup-compatibility/2006" xmlns:o="urn:schemas-microsoft-com:office:office" xmlns:r="http://schemas.openxmlformats.org/officeDocument/2006/relationships" xmlns:m="http://schemas.openxmlformats.org/officeDocument/2006/math" xmlns:v="urn:schemas-microsoft-com:vml" xmlns:wp14="http://schemas.microsoft.com/office/word/2010/wordprocessingDrawing" xmlns:wp="http://schemas.openxmlformats.org/drawingml/2006/wordprocessingDrawing" xmlns:w10="urn:schemas-microsoft-com:office:word" xmlns:w="http://schemas.openxmlformats.org/wordprocessingml/2006/main" xmlns:w14="http://schemas.microsoft.com/office/word/2010/wordml" xmlns:w15="http://schemas.microsoft.com/office/word/2012/wordml" xmlns:w16se="http://schemas.microsoft.com/office/word/2015/wordml/symex" xmlns:wpg="http://schemas.microsoft.com/office/word/2010/wordprocessingGroup" xmlns:wpi="http://schemas.microsoft.com/office/word/2010/wordprocessingInk" xmlns:wne="http://schemas.microsoft.com/office/word/2006/wordml" xmlns:wps="http://schemas.microsoft.com/office/word/2010/wordprocessingShape" mc:Ignorable="w14 w15 w16se wp14">
   <w:body>
     <w:p>
       <w:pPr>
@@ -626,6 +626,7 @@
           <w:rFonts w:ascii="Helvetica" w:hAnsi="Helvetica"/>
         </w:rPr>
       </w:pPr>
+      <w:proofErr w:type="spellStart"/>
       <w:r>
         <w:rPr>
           <w:rFonts w:ascii="Helvetica" w:hAnsi="Helvetica"/>
@@ -633,7 +634,26 @@
           <w:sz w:val="22"/>
           <w:szCs w:val="22"/>
         </w:rPr>
-        <w:t xml:space="preserve">Deadline: 29 maggio 2025   •   Piattaforma: Linux / </w:t>
+        <w:t>Deadline</w:t>
+      </w:r>
+      <w:proofErr w:type="spellEnd"/>
+      <w:r>
+        <w:rPr>
+          <w:rFonts w:ascii="Helvetica" w:hAnsi="Helvetica"/>
+          <w:color w:val="777777"/>
+          <w:sz w:val="22"/>
+          <w:szCs w:val="22"/>
+        </w:rPr>
+        <w:t>: 29 maggio 2026</w:t>
+      </w:r>
+      <w:r>
+        <w:rPr>
+          <w:rFonts w:ascii="Helvetica" w:hAnsi="Helvetica"/>
+          <w:color w:val="777777"/>
+          <w:sz w:val="22"/>
+          <w:szCs w:val="22"/>
+        </w:rPr>
+        <w:t xml:space="preserve">   •   Piattaforma: Linux / </w:t>
       </w:r>
       <w:proofErr w:type="spellStart"/>
       <w:r>
@@ -722,11 +742,40 @@
     </w:p>
     <w:p>
       <w:pPr>
-        <w:spacing w:after="160" w:line="276" w:lineRule="auto"/>
+        <w:spacing w:line="276" w:lineRule="auto"/>
+        <w:jc w:val="both"/>
         <w:rPr>
           <w:rFonts w:ascii="Helvetica" w:hAnsi="Helvetica"/>
         </w:rPr>
       </w:pPr>
+      <w:r>
+        <w:rPr>
+          <w:rFonts w:ascii="Helvetica" w:hAnsi="Helvetica"/>
+        </w:rPr>
+        <w:t xml:space="preserve">Per avviare il programma </w:t>
+      </w:r>
+      <w:proofErr w:type="gramStart"/>
+      <w:r>
+        <w:rPr>
+          <w:rFonts w:ascii="Helvetica" w:hAnsi="Helvetica"/>
+        </w:rPr>
+        <w:t xml:space="preserve">eseguire </w:t>
+      </w:r>
+      <w:r>
+        <w:rPr>
+          <w:rFonts w:ascii="Helvetica" w:hAnsi="Helvetica"/>
+          <w:b/>
+        </w:rPr>
+        <w:t>.</w:t>
+      </w:r>
+      <w:proofErr w:type="gramEnd"/>
+      <w:r>
+        <w:rPr>
+          <w:rFonts w:ascii="Helvetica" w:hAnsi="Helvetica"/>
+          <w:b/>
+        </w:rPr>
+        <w:t>/condominio</w:t>
+      </w:r>
     </w:p>
     <w:p>
       <w:pPr>
@@ -823,13 +872,23 @@
           <w:rFonts w:ascii="Helvetica" w:hAnsi="Helvetica"/>
         </w:rPr>
       </w:pPr>
+      <w:proofErr w:type="spellStart"/>
       <w:r>
         <w:rPr>
           <w:rFonts w:ascii="Helvetica" w:eastAsia="Courier New" w:hAnsi="Helvetica" w:cs="Courier New"/>
           <w:sz w:val="20"/>
           <w:szCs w:val="20"/>
         </w:rPr>
-        <w:t xml:space="preserve">make </w:t>
+        <w:t>make</w:t>
+      </w:r>
+      <w:proofErr w:type="spellEnd"/>
+      <w:r>
+        <w:rPr>
+          <w:rFonts w:ascii="Helvetica" w:eastAsia="Courier New" w:hAnsi="Helvetica" w:cs="Courier New"/>
+          <w:sz w:val="20"/>
+          <w:szCs w:val="20"/>
+        </w:rPr>
+        <w:t xml:space="preserve"> </w:t>
       </w:r>
       <w:proofErr w:type="spellStart"/>
       <w:r>
@@ -919,8 +978,15 @@
       <w:r>
         <w:rPr>
           <w:rFonts w:ascii="Helvetica" w:hAnsi="Helvetica"/>
-        </w:rPr>
-        <w:t>Gestione Richieste: inserimento, visualizzazione per stato/urgenza/area/tipologia/tecnico, ricerca per codice, aggiornamento stato.</w:t>
+          <w:b/>
+        </w:rPr>
+        <w:t>Gestione Richieste</w:t>
+      </w:r>
+      <w:r>
+        <w:rPr>
+          <w:rFonts w:ascii="Helvetica" w:hAnsi="Helvetica"/>
+        </w:rPr>
+        <w:t>: inserimento, visualizzazione per stato/urgenza/area/tipologia/tecnico, ricerca per codice, aggiornamento stato.</w:t>
       </w:r>
     </w:p>
     <w:p>
@@ -938,8 +1004,15 @@
       <w:r>
         <w:rPr>
           <w:rFonts w:ascii="Helvetica" w:hAnsi="Helvetica"/>
-        </w:rPr>
-        <w:t>Gestione Tecnici: registrazione nuovo tecnico, visualizzazione lista, monitoraggio carico di lavoro.</w:t>
+          <w:b/>
+        </w:rPr>
+        <w:t>Gestione Tecnici</w:t>
+      </w:r>
+      <w:r>
+        <w:rPr>
+          <w:rFonts w:ascii="Helvetica" w:hAnsi="Helvetica"/>
+        </w:rPr>
+        <w:t>: registrazione nuovo tecnico, visualizzazione lista, monitoraggio carico di lavoro.</w:t>
       </w:r>
     </w:p>
     <w:p>
@@ -957,8 +1030,15 @@
       <w:r>
         <w:rPr>
           <w:rFonts w:ascii="Helvetica" w:hAnsi="Helvetica"/>
-        </w:rPr>
-        <w:t>Pianificazione Interventi: assegnazione richiesta a tecnico, pianificazione con verifica conflitti di orario, aggiornamento stato nel BST.</w:t>
+          <w:b/>
+        </w:rPr>
+        <w:t>Pianificazione Interventi</w:t>
+      </w:r>
+      <w:r>
+        <w:rPr>
+          <w:rFonts w:ascii="Helvetica" w:hAnsi="Helvetica"/>
+        </w:rPr>
+        <w:t>: assegnazione richiesta a tecnico, pianificazione con verifica conflitti di orario, aggiornamento stato nel BST.</w:t>
       </w:r>
     </w:p>
     <w:p>
@@ -976,8 +1056,15 @@
       <w:r>
         <w:rPr>
           <w:rFonts w:ascii="Helvetica" w:hAnsi="Helvetica"/>
-        </w:rPr>
-        <w:t xml:space="preserve">Visualizzazione Urgenze: stampa delle richieste attive ordinate per livello di urgenza decrescente tramite la </w:t>
+          <w:b/>
+        </w:rPr>
+        <w:t>Visualizzazione Urgenze</w:t>
+      </w:r>
+      <w:r>
+        <w:rPr>
+          <w:rFonts w:ascii="Helvetica" w:hAnsi="Helvetica"/>
+        </w:rPr>
+        <w:t xml:space="preserve">: stampa delle richieste attive ordinate per livello di urgenza decrescente tramite la </w:t>
       </w:r>
       <w:proofErr w:type="spellStart"/>
       <w:r>
@@ -1009,8 +1096,15 @@
       <w:r>
         <w:rPr>
           <w:rFonts w:ascii="Helvetica" w:hAnsi="Helvetica"/>
-        </w:rPr>
-        <w:t>Report: storico interventi conclusi, statistiche tipologia, tempo medio di completamento, tecnico più attivo, area più problematica.</w:t>
+          <w:b/>
+        </w:rPr>
+        <w:t>Report</w:t>
+      </w:r>
+      <w:r>
+        <w:rPr>
+          <w:rFonts w:ascii="Helvetica" w:hAnsi="Helvetica"/>
+        </w:rPr>
+        <w:t>: storico interventi conclusi, statistiche tipologia, tempo medio di completamento, tecnico più attivo, area più problematica.</w:t>
       </w:r>
     </w:p>
     <w:p>
@@ -1153,7 +1247,14 @@
         <w:rPr>
           <w:rFonts w:ascii="Helvetica" w:hAnsi="Helvetica"/>
         </w:rPr>
-        <w:t>Il confronto avviene riga per riga tra l'output prodotto e il file oracolo atteso. I risultati (PASS/FAIL) vengono scritti nel file result.txt.</w:t>
+        <w:t xml:space="preserve">Il confronto avviene riga per riga tra l'output prodotto e il file oracolo atteso. I risultati (PASS/FAIL) vengono scritti nel file </w:t>
+      </w:r>
+      <w:r>
+        <w:rPr>
+          <w:rFonts w:ascii="Helvetica" w:hAnsi="Helvetica"/>
+          <w:b/>
+        </w:rPr>
+        <w:t>result.txt.</w:t>
       </w:r>
     </w:p>
     <w:p>
@@ -1250,6 +1351,7 @@
       <w:r>
         <w:rPr>
           <w:rFonts w:ascii="Helvetica" w:hAnsi="Helvetica"/>
+          <w:i/>
         </w:rPr>
         <w:t>tecnici.h</w:t>
       </w:r>
@@ -1257,6 +1359,7 @@
       <w:r>
         <w:rPr>
           <w:rFonts w:ascii="Helvetica" w:hAnsi="Helvetica"/>
+          <w:i/>
         </w:rPr>
         <w:t xml:space="preserve"> / </w:t>
       </w:r>
@@ -1264,6 +1367,7 @@
       <w:r>
         <w:rPr>
           <w:rFonts w:ascii="Helvetica" w:hAnsi="Helvetica"/>
+          <w:i/>
         </w:rPr>
         <w:t>tecnici.c</w:t>
       </w:r>
@@ -1278,6 +1382,7 @@
       <w:r>
         <w:rPr>
           <w:rFonts w:ascii="Helvetica" w:hAnsi="Helvetica"/>
+          <w:i/>
         </w:rPr>
         <w:t>ListaTecnici</w:t>
       </w:r>
@@ -1308,8 +1413,15 @@
       <w:r>
         <w:rPr>
           <w:rFonts w:ascii="Helvetica" w:hAnsi="Helvetica"/>
-        </w:rPr>
-        <w:t>Operazioni dominanti: inserimento di un nuovo tecnico, ricerca per nome/specializzazione, scorrimento per trovare il tecnico con minor carico.</w:t>
+          <w:b/>
+        </w:rPr>
+        <w:t>Operazioni dominanti:</w:t>
+      </w:r>
+      <w:r>
+        <w:rPr>
+          <w:rFonts w:ascii="Helvetica" w:hAnsi="Helvetica"/>
+        </w:rPr>
+        <w:t xml:space="preserve"> inserimento di un nuovo tecnico, ricerca per nome/specializzazione, scorrimento per trovare il tecnico con minor carico.</w:t>
       </w:r>
     </w:p>
     <w:p>
@@ -1326,11 +1438,13 @@
         <w:jc w:val="both"/>
         <w:rPr>
           <w:rFonts w:ascii="Helvetica" w:hAnsi="Helvetica"/>
+          <w:b/>
         </w:rPr>
       </w:pPr>
       <w:r>
         <w:rPr>
           <w:rFonts w:ascii="Helvetica" w:hAnsi="Helvetica"/>
+          <w:b/>
         </w:rPr>
         <w:t>Analisi della complessità:</w:t>
       </w:r>
@@ -1546,25 +1660,14 @@
                 <w:rFonts w:ascii="Helvetica" w:hAnsi="Helvetica"/>
               </w:rPr>
             </w:pPr>
-            <w:proofErr w:type="gramStart"/>
-            <w:r>
-              <w:rPr>
-                <w:rFonts w:ascii="Helvetica" w:hAnsi="Helvetica"/>
-                <w:color w:val="000000"/>
-                <w:sz w:val="22"/>
-                <w:szCs w:val="22"/>
-              </w:rPr>
-              <w:t>O(</w:t>
-            </w:r>
-            <w:proofErr w:type="gramEnd"/>
-            <w:r>
-              <w:rPr>
-                <w:rFonts w:ascii="Helvetica" w:hAnsi="Helvetica"/>
-                <w:color w:val="000000"/>
-                <w:sz w:val="22"/>
-                <w:szCs w:val="22"/>
-              </w:rPr>
-              <w:t>1)</w:t>
+            <w:r>
+              <w:rPr>
+                <w:rFonts w:ascii="Helvetica" w:hAnsi="Helvetica"/>
+                <w:color w:val="000000"/>
+                <w:sz w:val="22"/>
+                <w:szCs w:val="22"/>
+              </w:rPr>
+              <w:t>O(1)</w:t>
             </w:r>
           </w:p>
         </w:tc>
@@ -2058,6 +2161,7 @@
       <w:r>
         <w:rPr>
           <w:rFonts w:ascii="Helvetica" w:hAnsi="Helvetica"/>
+          <w:i/>
         </w:rPr>
         <w:t>richieste.h</w:t>
       </w:r>
@@ -2065,6 +2169,7 @@
       <w:r>
         <w:rPr>
           <w:rFonts w:ascii="Helvetica" w:hAnsi="Helvetica"/>
+          <w:i/>
         </w:rPr>
         <w:t xml:space="preserve"> / </w:t>
       </w:r>
@@ -2072,6 +2177,7 @@
       <w:r>
         <w:rPr>
           <w:rFonts w:ascii="Helvetica" w:hAnsi="Helvetica"/>
+          <w:i/>
         </w:rPr>
         <w:t>richieste.c</w:t>
       </w:r>
@@ -2128,7 +2234,25 @@
           <w:b/>
           <w:bCs/>
         </w:rPr>
-        <w:t>Coda a Priorità basata su Max-Heap (</w:t>
+        <w:t>Coda a Priorità basata su Max-</w:t>
+      </w:r>
+      <w:proofErr w:type="spellStart"/>
+      <w:r>
+        <w:rPr>
+          <w:rFonts w:ascii="Helvetica" w:hAnsi="Helvetica"/>
+          <w:b/>
+          <w:bCs/>
+        </w:rPr>
+        <w:t>Heap</w:t>
+      </w:r>
+      <w:proofErr w:type="spellEnd"/>
+      <w:r>
+        <w:rPr>
+          <w:rFonts w:ascii="Helvetica" w:hAnsi="Helvetica"/>
+          <w:b/>
+          <w:bCs/>
+        </w:rPr>
+        <w:t xml:space="preserve"> (</w:t>
       </w:r>
       <w:proofErr w:type="spellStart"/>
       <w:r>
@@ -2174,8 +2298,15 @@
       <w:r>
         <w:rPr>
           <w:rFonts w:ascii="Helvetica" w:hAnsi="Helvetica"/>
-        </w:rPr>
-        <w:t xml:space="preserve">Analisi della complessità per la </w:t>
+          <w:b/>
+        </w:rPr>
+        <w:t>Analisi della complessità</w:t>
+      </w:r>
+      <w:r>
+        <w:rPr>
+          <w:rFonts w:ascii="Helvetica" w:hAnsi="Helvetica"/>
+        </w:rPr>
+        <w:t xml:space="preserve"> per la </w:t>
       </w:r>
       <w:proofErr w:type="spellStart"/>
       <w:r>
@@ -2415,25 +2546,14 @@
                 <w:rFonts w:ascii="Helvetica" w:hAnsi="Helvetica"/>
               </w:rPr>
             </w:pPr>
-            <w:proofErr w:type="gramStart"/>
-            <w:r>
-              <w:rPr>
-                <w:rFonts w:ascii="Helvetica" w:hAnsi="Helvetica"/>
-                <w:color w:val="000000"/>
-                <w:sz w:val="22"/>
-                <w:szCs w:val="22"/>
-              </w:rPr>
-              <w:t>O(</w:t>
-            </w:r>
-            <w:proofErr w:type="gramEnd"/>
-            <w:r>
-              <w:rPr>
-                <w:rFonts w:ascii="Helvetica" w:hAnsi="Helvetica"/>
-                <w:color w:val="000000"/>
-                <w:sz w:val="22"/>
-                <w:szCs w:val="22"/>
-              </w:rPr>
-              <w:t xml:space="preserve">log n) — </w:t>
+            <w:r>
+              <w:rPr>
+                <w:rFonts w:ascii="Helvetica" w:hAnsi="Helvetica"/>
+                <w:color w:val="000000"/>
+                <w:sz w:val="22"/>
+                <w:szCs w:val="22"/>
+              </w:rPr>
+              <w:t xml:space="preserve">O(log n) — </w:t>
             </w:r>
             <w:proofErr w:type="spellStart"/>
             <w:r>
@@ -2558,25 +2678,14 @@
                 <w:rFonts w:ascii="Helvetica" w:hAnsi="Helvetica"/>
               </w:rPr>
             </w:pPr>
-            <w:proofErr w:type="gramStart"/>
-            <w:r>
-              <w:rPr>
-                <w:rFonts w:ascii="Helvetica" w:hAnsi="Helvetica"/>
-                <w:color w:val="000000"/>
-                <w:sz w:val="22"/>
-                <w:szCs w:val="22"/>
-              </w:rPr>
-              <w:t>O(</w:t>
-            </w:r>
-            <w:proofErr w:type="gramEnd"/>
-            <w:r>
-              <w:rPr>
-                <w:rFonts w:ascii="Helvetica" w:hAnsi="Helvetica"/>
-                <w:color w:val="000000"/>
-                <w:sz w:val="22"/>
-                <w:szCs w:val="22"/>
-              </w:rPr>
-              <w:t xml:space="preserve">log n) — </w:t>
+            <w:r>
+              <w:rPr>
+                <w:rFonts w:ascii="Helvetica" w:hAnsi="Helvetica"/>
+                <w:color w:val="000000"/>
+                <w:sz w:val="22"/>
+                <w:szCs w:val="22"/>
+              </w:rPr>
+              <w:t xml:space="preserve">O(log n) — </w:t>
             </w:r>
             <w:proofErr w:type="spellStart"/>
             <w:r>
@@ -2616,25 +2725,14 @@
                 <w:rFonts w:ascii="Helvetica" w:hAnsi="Helvetica"/>
               </w:rPr>
             </w:pPr>
-            <w:proofErr w:type="gramStart"/>
-            <w:r>
-              <w:rPr>
-                <w:rFonts w:ascii="Helvetica" w:hAnsi="Helvetica"/>
-                <w:color w:val="000000"/>
-                <w:sz w:val="22"/>
-                <w:szCs w:val="22"/>
-              </w:rPr>
-              <w:t>O(</w:t>
-            </w:r>
-            <w:proofErr w:type="gramEnd"/>
-            <w:r>
-              <w:rPr>
-                <w:rFonts w:ascii="Helvetica" w:hAnsi="Helvetica"/>
-                <w:color w:val="000000"/>
-                <w:sz w:val="22"/>
-                <w:szCs w:val="22"/>
-              </w:rPr>
-              <w:t>1) — rimozione in testa</w:t>
+            <w:r>
+              <w:rPr>
+                <w:rFonts w:ascii="Helvetica" w:hAnsi="Helvetica"/>
+                <w:color w:val="000000"/>
+                <w:sz w:val="22"/>
+                <w:szCs w:val="22"/>
+              </w:rPr>
+              <w:t>O(1) — rimozione in testa</w:t>
             </w:r>
           </w:p>
         </w:tc>
@@ -2712,25 +2810,14 @@
                 <w:rFonts w:ascii="Helvetica" w:hAnsi="Helvetica"/>
               </w:rPr>
             </w:pPr>
-            <w:proofErr w:type="gramStart"/>
-            <w:r>
-              <w:rPr>
-                <w:rFonts w:ascii="Helvetica" w:hAnsi="Helvetica"/>
-                <w:color w:val="000000"/>
-                <w:sz w:val="22"/>
-                <w:szCs w:val="22"/>
-              </w:rPr>
-              <w:t>O(</w:t>
-            </w:r>
-            <w:proofErr w:type="gramEnd"/>
-            <w:r>
-              <w:rPr>
-                <w:rFonts w:ascii="Helvetica" w:hAnsi="Helvetica"/>
-                <w:color w:val="000000"/>
-                <w:sz w:val="22"/>
-                <w:szCs w:val="22"/>
-              </w:rPr>
-              <w:t>1)</w:t>
+            <w:r>
+              <w:rPr>
+                <w:rFonts w:ascii="Helvetica" w:hAnsi="Helvetica"/>
+                <w:color w:val="000000"/>
+                <w:sz w:val="22"/>
+                <w:szCs w:val="22"/>
+              </w:rPr>
+              <w:t>O(1)</w:t>
             </w:r>
           </w:p>
         </w:tc>
@@ -2759,25 +2846,14 @@
                 <w:rFonts w:ascii="Helvetica" w:hAnsi="Helvetica"/>
               </w:rPr>
             </w:pPr>
-            <w:proofErr w:type="gramStart"/>
-            <w:r>
-              <w:rPr>
-                <w:rFonts w:ascii="Helvetica" w:hAnsi="Helvetica"/>
-                <w:color w:val="000000"/>
-                <w:sz w:val="22"/>
-                <w:szCs w:val="22"/>
-              </w:rPr>
-              <w:t>O(</w:t>
-            </w:r>
-            <w:proofErr w:type="gramEnd"/>
-            <w:r>
-              <w:rPr>
-                <w:rFonts w:ascii="Helvetica" w:hAnsi="Helvetica"/>
-                <w:color w:val="000000"/>
-                <w:sz w:val="22"/>
-                <w:szCs w:val="22"/>
-              </w:rPr>
-              <w:t>1)</w:t>
+            <w:r>
+              <w:rPr>
+                <w:rFonts w:ascii="Helvetica" w:hAnsi="Helvetica"/>
+                <w:color w:val="000000"/>
+                <w:sz w:val="22"/>
+                <w:szCs w:val="22"/>
+              </w:rPr>
+              <w:t>O(1)</w:t>
             </w:r>
           </w:p>
         </w:tc>
@@ -2990,6 +3066,7 @@
       <w:r>
         <w:rPr>
           <w:rFonts w:ascii="Helvetica" w:hAnsi="Helvetica"/>
+          <w:i/>
         </w:rPr>
         <w:t>schedule.h</w:t>
       </w:r>
@@ -2997,6 +3074,7 @@
       <w:r>
         <w:rPr>
           <w:rFonts w:ascii="Helvetica" w:hAnsi="Helvetica"/>
+          <w:i/>
         </w:rPr>
         <w:t xml:space="preserve"> / </w:t>
       </w:r>
@@ -3004,6 +3082,7 @@
       <w:r>
         <w:rPr>
           <w:rFonts w:ascii="Helvetica" w:hAnsi="Helvetica"/>
+          <w:i/>
         </w:rPr>
         <w:t>schedule.c</w:t>
       </w:r>
@@ -3018,6 +3097,7 @@
       <w:r>
         <w:rPr>
           <w:rFonts w:ascii="Helvetica" w:hAnsi="Helvetica"/>
+          <w:i/>
         </w:rPr>
         <w:t>Binary</w:t>
       </w:r>
@@ -3025,8 +3105,53 @@
       <w:r>
         <w:rPr>
           <w:rFonts w:ascii="Helvetica" w:hAnsi="Helvetica"/>
-        </w:rPr>
-        <w:t xml:space="preserve"> Search Tree) come tipo di dato opaco (Schedule), in cui ogni nodo memorizza una struttura Data (anno, mese, giorno, </w:t>
+          <w:i/>
+        </w:rPr>
+        <w:t xml:space="preserve"> </w:t>
+      </w:r>
+      <w:proofErr w:type="spellStart"/>
+      <w:r>
+        <w:rPr>
+          <w:rFonts w:ascii="Helvetica" w:hAnsi="Helvetica"/>
+          <w:i/>
+        </w:rPr>
+        <w:t>Search</w:t>
+      </w:r>
+      <w:proofErr w:type="spellEnd"/>
+      <w:r>
+        <w:rPr>
+          <w:rFonts w:ascii="Helvetica" w:hAnsi="Helvetica"/>
+          <w:i/>
+        </w:rPr>
+        <w:t xml:space="preserve"> </w:t>
+      </w:r>
+      <w:proofErr w:type="spellStart"/>
+      <w:r>
+        <w:rPr>
+          <w:rFonts w:ascii="Helvetica" w:hAnsi="Helvetica"/>
+          <w:i/>
+        </w:rPr>
+        <w:t>Tree</w:t>
+      </w:r>
+      <w:proofErr w:type="spellEnd"/>
+      <w:r>
+        <w:rPr>
+          <w:rFonts w:ascii="Helvetica" w:hAnsi="Helvetica"/>
+        </w:rPr>
+        <w:t>) come tipo di dato opaco (</w:t>
+      </w:r>
+      <w:r>
+        <w:rPr>
+          <w:rFonts w:ascii="Helvetica" w:hAnsi="Helvetica"/>
+          <w:i/>
+        </w:rPr>
+        <w:t>Schedule</w:t>
+      </w:r>
+      <w:r>
+        <w:rPr>
+          <w:rFonts w:ascii="Helvetica" w:hAnsi="Helvetica"/>
+        </w:rPr>
+        <w:t xml:space="preserve">), in cui ogni nodo memorizza una struttura Data (anno, mese, giorno, </w:t>
       </w:r>
       <w:proofErr w:type="spellStart"/>
       <w:r>
@@ -3113,8 +3238,15 @@
       <w:r>
         <w:rPr>
           <w:rFonts w:ascii="Helvetica" w:hAnsi="Helvetica"/>
-        </w:rPr>
-        <w:t>Analisi della complessità:</w:t>
+          <w:b/>
+        </w:rPr>
+        <w:t>Analisi della complessità</w:t>
+      </w:r>
+      <w:r>
+        <w:rPr>
+          <w:rFonts w:ascii="Helvetica" w:hAnsi="Helvetica"/>
+        </w:rPr>
+        <w:t>:</w:t>
       </w:r>
     </w:p>
     <w:tbl>
@@ -3329,27 +3461,18 @@
               <w:spacing w:line="276" w:lineRule="auto"/>
               <w:rPr>
                 <w:rFonts w:ascii="Helvetica" w:hAnsi="Helvetica"/>
-              </w:rPr>
-            </w:pPr>
-            <w:proofErr w:type="gramStart"/>
-            <w:r>
-              <w:rPr>
-                <w:rFonts w:ascii="Helvetica" w:hAnsi="Helvetica"/>
-                <w:color w:val="000000"/>
-                <w:sz w:val="22"/>
-                <w:szCs w:val="22"/>
-              </w:rPr>
-              <w:t>O(</w:t>
-            </w:r>
-            <w:proofErr w:type="gramEnd"/>
-            <w:r>
-              <w:rPr>
-                <w:rFonts w:ascii="Helvetica" w:hAnsi="Helvetica"/>
-                <w:color w:val="000000"/>
-                <w:sz w:val="22"/>
-                <w:szCs w:val="22"/>
-              </w:rPr>
-              <w:t>log n) caso medio</w:t>
+                <w:lang w:val="es-ES"/>
+              </w:rPr>
+            </w:pPr>
+            <w:r>
+              <w:rPr>
+                <w:rFonts w:ascii="Helvetica" w:hAnsi="Helvetica"/>
+                <w:color w:val="000000"/>
+                <w:sz w:val="22"/>
+                <w:szCs w:val="22"/>
+                <w:lang w:val="es-ES"/>
+              </w:rPr>
+              <w:t>O(log n) caso medio</w:t>
             </w:r>
           </w:p>
         </w:tc>
@@ -3461,27 +3584,18 @@
               <w:spacing w:line="276" w:lineRule="auto"/>
               <w:rPr>
                 <w:rFonts w:ascii="Helvetica" w:hAnsi="Helvetica"/>
-              </w:rPr>
-            </w:pPr>
-            <w:proofErr w:type="gramStart"/>
-            <w:r>
-              <w:rPr>
-                <w:rFonts w:ascii="Helvetica" w:hAnsi="Helvetica"/>
-                <w:color w:val="000000"/>
-                <w:sz w:val="22"/>
-                <w:szCs w:val="22"/>
-              </w:rPr>
-              <w:t>O(</w:t>
-            </w:r>
-            <w:proofErr w:type="gramEnd"/>
-            <w:r>
-              <w:rPr>
-                <w:rFonts w:ascii="Helvetica" w:hAnsi="Helvetica"/>
-                <w:color w:val="000000"/>
-                <w:sz w:val="22"/>
-                <w:szCs w:val="22"/>
-              </w:rPr>
-              <w:t>log n) caso medio</w:t>
+                <w:lang w:val="es-ES"/>
+              </w:rPr>
+            </w:pPr>
+            <w:r>
+              <w:rPr>
+                <w:rFonts w:ascii="Helvetica" w:hAnsi="Helvetica"/>
+                <w:color w:val="000000"/>
+                <w:sz w:val="22"/>
+                <w:szCs w:val="22"/>
+                <w:lang w:val="es-ES"/>
+              </w:rPr>
+              <w:t>O(log n) caso medio</w:t>
             </w:r>
           </w:p>
         </w:tc>
@@ -4053,6 +4167,7 @@
       <w:r>
         <w:rPr>
           <w:rFonts w:ascii="Helvetica" w:hAnsi="Helvetica"/>
+          <w:b/>
         </w:rPr>
         <w:t>tipi.h</w:t>
       </w:r>
@@ -4122,6 +4237,7 @@
       <w:r>
         <w:rPr>
           <w:rFonts w:ascii="Helvetica" w:hAnsi="Helvetica"/>
+          <w:b/>
         </w:rPr>
         <w:t>utile.h</w:t>
       </w:r>
@@ -4129,6 +4245,7 @@
       <w:r>
         <w:rPr>
           <w:rFonts w:ascii="Helvetica" w:hAnsi="Helvetica"/>
+          <w:b/>
         </w:rPr>
         <w:t xml:space="preserve"> / </w:t>
       </w:r>
@@ -4136,6 +4253,7 @@
       <w:r>
         <w:rPr>
           <w:rFonts w:ascii="Helvetica" w:hAnsi="Helvetica"/>
+          <w:b/>
         </w:rPr>
         <w:t>utile.c</w:t>
       </w:r>
@@ -4233,6 +4351,7 @@
       <w:r>
         <w:rPr>
           <w:rFonts w:ascii="Helvetica" w:hAnsi="Helvetica"/>
+          <w:b/>
         </w:rPr>
         <w:t>richieste.h</w:t>
       </w:r>
@@ -4240,6 +4359,7 @@
       <w:r>
         <w:rPr>
           <w:rFonts w:ascii="Helvetica" w:hAnsi="Helvetica"/>
+          <w:b/>
         </w:rPr>
         <w:t xml:space="preserve"> / </w:t>
       </w:r>
@@ -4247,6 +4367,7 @@
       <w:r>
         <w:rPr>
           <w:rFonts w:ascii="Helvetica" w:hAnsi="Helvetica"/>
+          <w:b/>
         </w:rPr>
         <w:t>richieste.c</w:t>
       </w:r>
@@ -4316,6 +4437,7 @@
       <w:r>
         <w:rPr>
           <w:rFonts w:ascii="Helvetica" w:hAnsi="Helvetica"/>
+          <w:b/>
         </w:rPr>
         <w:t>tecnici.h</w:t>
       </w:r>
@@ -4323,6 +4445,7 @@
       <w:r>
         <w:rPr>
           <w:rFonts w:ascii="Helvetica" w:hAnsi="Helvetica"/>
+          <w:b/>
         </w:rPr>
         <w:t xml:space="preserve"> / </w:t>
       </w:r>
@@ -4330,6 +4453,7 @@
       <w:r>
         <w:rPr>
           <w:rFonts w:ascii="Helvetica" w:hAnsi="Helvetica"/>
+          <w:b/>
         </w:rPr>
         <w:t>tecnici.c</w:t>
       </w:r>
@@ -4399,33 +4523,40 @@
       <w:r>
         <w:rPr>
           <w:rFonts w:ascii="Helvetica" w:hAnsi="Helvetica"/>
+          <w:b/>
+        </w:rPr>
+        <w:t>schedule.h</w:t>
+      </w:r>
+      <w:proofErr w:type="spellEnd"/>
+      <w:r>
+        <w:rPr>
+          <w:rFonts w:ascii="Helvetica" w:hAnsi="Helvetica"/>
+          <w:b/>
+        </w:rPr>
+        <w:t xml:space="preserve"> / </w:t>
+      </w:r>
+      <w:proofErr w:type="spellStart"/>
+      <w:r>
+        <w:rPr>
+          <w:rFonts w:ascii="Helvetica" w:hAnsi="Helvetica"/>
+          <w:b/>
+        </w:rPr>
+        <w:t>schedule.c</w:t>
+      </w:r>
+      <w:proofErr w:type="spellEnd"/>
+      <w:r>
+        <w:rPr>
+          <w:rFonts w:ascii="Helvetica" w:hAnsi="Helvetica"/>
+          <w:b/>
+        </w:rPr>
+        <w:t xml:space="preserve"> </w:t>
+      </w:r>
+      <w:r>
+        <w:rPr>
+          <w:rFonts w:ascii="Helvetica" w:hAnsi="Helvetica"/>
           <w:lang w:val="en-GB"/>
         </w:rPr>
-        <w:t>schedule.h</w:t>
-      </w:r>
-      <w:proofErr w:type="spellEnd"/>
-      <w:r>
-        <w:rPr>
-          <w:rFonts w:ascii="Helvetica" w:hAnsi="Helvetica"/>
-          <w:lang w:val="en-GB"/>
-        </w:rPr>
-        <w:t xml:space="preserve"> / </w:t>
-      </w:r>
-      <w:proofErr w:type="spellStart"/>
-      <w:r>
-        <w:rPr>
-          <w:rFonts w:ascii="Helvetica" w:hAnsi="Helvetica"/>
-          <w:lang w:val="en-GB"/>
-        </w:rPr>
-        <w:t>schedule.c</w:t>
-      </w:r>
-      <w:proofErr w:type="spellEnd"/>
-      <w:r>
-        <w:rPr>
-          <w:rFonts w:ascii="Helvetica" w:hAnsi="Helvetica"/>
-          <w:lang w:val="en-GB"/>
-        </w:rPr>
-        <w:t xml:space="preserve"> — ADT BST </w:t>
+        <w:t xml:space="preserve">— ADT BST </w:t>
       </w:r>
       <w:proofErr w:type="spellStart"/>
       <w:r>
@@ -4913,7 +5044,6 @@
               </w:rPr>
             </w:pPr>
             <w:proofErr w:type="spellStart"/>
-            <w:proofErr w:type="gramStart"/>
             <w:r>
               <w:rPr>
                 <w:rFonts w:ascii="Helvetica" w:hAnsi="Helvetica"/>
@@ -4931,17 +5061,7 @@
                 <w:sz w:val="22"/>
                 <w:szCs w:val="22"/>
               </w:rPr>
-              <w:t>[</w:t>
-            </w:r>
-            <w:proofErr w:type="gramEnd"/>
-            <w:r>
-              <w:rPr>
-                <w:rFonts w:ascii="Helvetica" w:hAnsi="Helvetica"/>
-                <w:color w:val="000000"/>
-                <w:sz w:val="22"/>
-                <w:szCs w:val="22"/>
-              </w:rPr>
-              <w:t>100]</w:t>
+              <w:t>[100]</w:t>
             </w:r>
           </w:p>
         </w:tc>
@@ -5166,7 +5286,6 @@
               </w:rPr>
             </w:pPr>
             <w:proofErr w:type="spellStart"/>
-            <w:proofErr w:type="gramStart"/>
             <w:r>
               <w:rPr>
                 <w:rFonts w:ascii="Helvetica" w:hAnsi="Helvetica"/>
@@ -5184,17 +5303,7 @@
                 <w:sz w:val="22"/>
                 <w:szCs w:val="22"/>
               </w:rPr>
-              <w:t>[</w:t>
-            </w:r>
-            <w:proofErr w:type="gramEnd"/>
-            <w:r>
-              <w:rPr>
-                <w:rFonts w:ascii="Helvetica" w:hAnsi="Helvetica"/>
-                <w:color w:val="000000"/>
-                <w:sz w:val="22"/>
-                <w:szCs w:val="22"/>
-              </w:rPr>
-              <w:t>100]</w:t>
+              <w:t>[100]</w:t>
             </w:r>
           </w:p>
         </w:tc>
@@ -5298,7 +5407,6 @@
               </w:rPr>
             </w:pPr>
             <w:proofErr w:type="spellStart"/>
-            <w:proofErr w:type="gramStart"/>
             <w:r>
               <w:rPr>
                 <w:rFonts w:ascii="Helvetica" w:hAnsi="Helvetica"/>
@@ -5316,17 +5424,7 @@
                 <w:sz w:val="22"/>
                 <w:szCs w:val="22"/>
               </w:rPr>
-              <w:t>[</w:t>
-            </w:r>
-            <w:proofErr w:type="gramEnd"/>
-            <w:r>
-              <w:rPr>
-                <w:rFonts w:ascii="Helvetica" w:hAnsi="Helvetica"/>
-                <w:color w:val="000000"/>
-                <w:sz w:val="22"/>
-                <w:szCs w:val="22"/>
-              </w:rPr>
-              <w:t>11]</w:t>
+              <w:t>[11]</w:t>
             </w:r>
           </w:p>
         </w:tc>
@@ -5432,7 +5530,6 @@
               </w:rPr>
             </w:pPr>
             <w:proofErr w:type="spellStart"/>
-            <w:proofErr w:type="gramStart"/>
             <w:r>
               <w:rPr>
                 <w:rFonts w:ascii="Helvetica" w:hAnsi="Helvetica"/>
@@ -5450,17 +5547,7 @@
                 <w:sz w:val="22"/>
                 <w:szCs w:val="22"/>
               </w:rPr>
-              <w:t>[</w:t>
-            </w:r>
-            <w:proofErr w:type="gramEnd"/>
-            <w:r>
-              <w:rPr>
-                <w:rFonts w:ascii="Helvetica" w:hAnsi="Helvetica"/>
-                <w:color w:val="000000"/>
-                <w:sz w:val="22"/>
-                <w:szCs w:val="22"/>
-              </w:rPr>
-              <w:t>11]</w:t>
+              <w:t>[11]</w:t>
             </w:r>
           </w:p>
         </w:tc>
@@ -5564,7 +5651,6 @@
               </w:rPr>
             </w:pPr>
             <w:proofErr w:type="spellStart"/>
-            <w:proofErr w:type="gramStart"/>
             <w:r>
               <w:rPr>
                 <w:rFonts w:ascii="Helvetica" w:hAnsi="Helvetica"/>
@@ -5582,17 +5668,7 @@
                 <w:sz w:val="22"/>
                 <w:szCs w:val="22"/>
               </w:rPr>
-              <w:t>[</w:t>
-            </w:r>
-            <w:proofErr w:type="gramEnd"/>
-            <w:r>
-              <w:rPr>
-                <w:rFonts w:ascii="Helvetica" w:hAnsi="Helvetica"/>
-                <w:color w:val="000000"/>
-                <w:sz w:val="22"/>
-                <w:szCs w:val="22"/>
-              </w:rPr>
-              <w:t>100]</w:t>
+              <w:t>[100]</w:t>
             </w:r>
           </w:p>
         </w:tc>
@@ -6233,7 +6309,6 @@
               </w:rPr>
             </w:pPr>
             <w:proofErr w:type="spellStart"/>
-            <w:proofErr w:type="gramStart"/>
             <w:r>
               <w:rPr>
                 <w:rFonts w:ascii="Helvetica" w:hAnsi="Helvetica"/>
@@ -6251,17 +6326,7 @@
                 <w:sz w:val="22"/>
                 <w:szCs w:val="22"/>
               </w:rPr>
-              <w:t>[</w:t>
-            </w:r>
-            <w:proofErr w:type="gramEnd"/>
-            <w:r>
-              <w:rPr>
-                <w:rFonts w:ascii="Helvetica" w:hAnsi="Helvetica"/>
-                <w:color w:val="000000"/>
-                <w:sz w:val="22"/>
-                <w:szCs w:val="22"/>
-              </w:rPr>
-              <w:t>10]</w:t>
+              <w:t>[10]</w:t>
             </w:r>
           </w:p>
         </w:tc>
@@ -7437,6 +7502,7 @@
       <w:r>
         <w:rPr>
           <w:rFonts w:ascii="Helvetica" w:hAnsi="Helvetica"/>
+          <w:i/>
         </w:rPr>
         <w:t>transisioneValida</w:t>
       </w:r>
@@ -7451,6 +7517,7 @@
       <w:r>
         <w:rPr>
           <w:rFonts w:ascii="Helvetica" w:hAnsi="Helvetica"/>
+          <w:i/>
         </w:rPr>
         <w:t>aggiornaStato</w:t>
       </w:r>
@@ -7513,9 +7580,19 @@
           <w:sz w:val="22"/>
           <w:szCs w:val="22"/>
         </w:rPr>
-        <w:t xml:space="preserve">  </w:t>
-      </w:r>
-      <w:proofErr w:type="gramStart"/>
+        <w:t xml:space="preserve">  PIANIFICATA  </w:t>
+      </w:r>
+      <w:r>
+        <w:rPr>
+          <w:rFonts w:eastAsia="Courier New"/>
+          <w:b/>
+          <w:bCs/>
+          <w:color w:val="1F4E79"/>
+          <w:sz w:val="22"/>
+          <w:szCs w:val="22"/>
+        </w:rPr>
+        <w:t>→</w:t>
+      </w:r>
       <w:r>
         <w:rPr>
           <w:rFonts w:ascii="Helvetica" w:eastAsia="Courier New" w:hAnsi="Helvetica" w:cs="Courier New"/>
@@ -7525,7 +7602,7 @@
           <w:sz w:val="22"/>
           <w:szCs w:val="22"/>
         </w:rPr>
-        <w:t xml:space="preserve">PIANIFICATA  </w:t>
+        <w:t xml:space="preserve">  IN_LAVORAZIONE  </w:t>
       </w:r>
       <w:r>
         <w:rPr>
@@ -7538,7 +7615,6 @@
         </w:rPr>
         <w:t>→</w:t>
       </w:r>
-      <w:proofErr w:type="gramEnd"/>
       <w:r>
         <w:rPr>
           <w:rFonts w:ascii="Helvetica" w:eastAsia="Courier New" w:hAnsi="Helvetica" w:cs="Courier New"/>
@@ -7548,41 +7624,6 @@
           <w:sz w:val="22"/>
           <w:szCs w:val="22"/>
         </w:rPr>
-        <w:t xml:space="preserve">  IN_</w:t>
-      </w:r>
-      <w:proofErr w:type="gramStart"/>
-      <w:r>
-        <w:rPr>
-          <w:rFonts w:ascii="Helvetica" w:eastAsia="Courier New" w:hAnsi="Helvetica" w:cs="Courier New"/>
-          <w:b/>
-          <w:bCs/>
-          <w:color w:val="1F4E79"/>
-          <w:sz w:val="22"/>
-          <w:szCs w:val="22"/>
-        </w:rPr>
-        <w:t xml:space="preserve">LAVORAZIONE  </w:t>
-      </w:r>
-      <w:r>
-        <w:rPr>
-          <w:rFonts w:eastAsia="Courier New"/>
-          <w:b/>
-          <w:bCs/>
-          <w:color w:val="1F4E79"/>
-          <w:sz w:val="22"/>
-          <w:szCs w:val="22"/>
-        </w:rPr>
-        <w:t>→</w:t>
-      </w:r>
-      <w:proofErr w:type="gramEnd"/>
-      <w:r>
-        <w:rPr>
-          <w:rFonts w:ascii="Helvetica" w:eastAsia="Courier New" w:hAnsi="Helvetica" w:cs="Courier New"/>
-          <w:b/>
-          <w:bCs/>
-          <w:color w:val="1F4E79"/>
-          <w:sz w:val="22"/>
-          <w:szCs w:val="22"/>
-        </w:rPr>
         <w:t xml:space="preserve">  CONCLUSA</w:t>
       </w:r>
     </w:p>
@@ -7605,6 +7646,14 @@
         </w:rPr>
         <w:t>Da qualsiasi stato intermedio è possibile passare ad ANNULLATA</w:t>
       </w:r>
+    </w:p>
+    <w:p>
+      <w:pPr>
+        <w:spacing w:after="160" w:line="276" w:lineRule="auto"/>
+        <w:rPr>
+          <w:rFonts w:ascii="Helvetica" w:hAnsi="Helvetica"/>
+        </w:rPr>
+      </w:pPr>
     </w:p>
     <w:p>
       <w:pPr>
@@ -7627,6 +7676,7 @@
         <w:rPr>
           <w:rFonts w:ascii="Helvetica" w:hAnsi="Helvetica"/>
         </w:rPr>
+        <w:lastRenderedPageBreak/>
         <w:t>3.4  Interazione</w:t>
       </w:r>
       <w:proofErr w:type="gramEnd"/>
@@ -7649,13 +7699,13 @@
         <w:rPr>
           <w:rFonts w:ascii="Helvetica" w:hAnsi="Helvetica"/>
         </w:rPr>
-        <w:lastRenderedPageBreak/>
         <w:t xml:space="preserve">Quando l'utente inserisce una nuova richiesta, questa viene creata con </w:t>
       </w:r>
       <w:proofErr w:type="spellStart"/>
       <w:r>
         <w:rPr>
           <w:rFonts w:ascii="Helvetica" w:hAnsi="Helvetica"/>
+          <w:i/>
         </w:rPr>
         <w:t>creaRichiesta</w:t>
       </w:r>
@@ -7670,6 +7720,7 @@
       <w:r>
         <w:rPr>
           <w:rFonts w:ascii="Helvetica" w:hAnsi="Helvetica"/>
+          <w:i/>
         </w:rPr>
         <w:t>inserisciRichiesta</w:t>
       </w:r>
@@ -7698,6 +7749,7 @@
       <w:r>
         <w:rPr>
           <w:rFonts w:ascii="Helvetica" w:hAnsi="Helvetica"/>
+          <w:i/>
         </w:rPr>
         <w:t>insertPQ</w:t>
       </w:r>
@@ -7735,6 +7787,7 @@
       <w:r>
         <w:rPr>
           <w:rFonts w:ascii="Helvetica" w:hAnsi="Helvetica"/>
+          <w:i/>
         </w:rPr>
         <w:t>assegnaRichiesta</w:t>
       </w:r>
@@ -7786,6 +7839,7 @@
       <w:r>
         <w:rPr>
           <w:rFonts w:ascii="Helvetica" w:hAnsi="Helvetica"/>
+          <w:i/>
         </w:rPr>
         <w:t>planIntervento</w:t>
       </w:r>
@@ -7800,6 +7854,7 @@
       <w:r>
         <w:rPr>
           <w:rFonts w:ascii="Helvetica" w:hAnsi="Helvetica"/>
+          <w:i/>
         </w:rPr>
         <w:t>verificaConflitti</w:t>
       </w:r>
@@ -7828,6 +7883,7 @@
       <w:r>
         <w:rPr>
           <w:rFonts w:ascii="Helvetica" w:hAnsi="Helvetica"/>
+          <w:i/>
         </w:rPr>
         <w:t>aggiornaStatoDaCodice</w:t>
       </w:r>
@@ -8086,7 +8142,6 @@
               <w:t xml:space="preserve">Richiesta* </w:t>
             </w:r>
             <w:proofErr w:type="spellStart"/>
-            <w:proofErr w:type="gramStart"/>
             <w:r>
               <w:rPr>
                 <w:rFonts w:ascii="Helvetica" w:hAnsi="Helvetica"/>
@@ -8107,7 +8162,6 @@
               <w:t>(</w:t>
             </w:r>
             <w:proofErr w:type="spellStart"/>
-            <w:proofErr w:type="gramEnd"/>
             <w:r>
               <w:rPr>
                 <w:rFonts w:ascii="Helvetica" w:hAnsi="Helvetica"/>
@@ -8565,10 +8619,29 @@
                 <w:sz w:val="22"/>
                 <w:szCs w:val="22"/>
               </w:rPr>
-              <w:t>Alloca memoria heap (</w:t>
+              <w:t xml:space="preserve">Alloca memoria </w:t>
             </w:r>
             <w:proofErr w:type="spellStart"/>
-            <w:proofErr w:type="gramStart"/>
+            <w:r>
+              <w:rPr>
+                <w:rFonts w:ascii="Helvetica" w:hAnsi="Helvetica"/>
+                <w:color w:val="000000"/>
+                <w:sz w:val="22"/>
+                <w:szCs w:val="22"/>
+              </w:rPr>
+              <w:t>heap</w:t>
+            </w:r>
+            <w:proofErr w:type="spellEnd"/>
+            <w:r>
+              <w:rPr>
+                <w:rFonts w:ascii="Helvetica" w:hAnsi="Helvetica"/>
+                <w:color w:val="000000"/>
+                <w:sz w:val="22"/>
+                <w:szCs w:val="22"/>
+              </w:rPr>
+              <w:t xml:space="preserve"> (</w:t>
+            </w:r>
+            <w:proofErr w:type="spellStart"/>
             <w:r>
               <w:rPr>
                 <w:rFonts w:ascii="Helvetica" w:hAnsi="Helvetica"/>
@@ -8586,17 +8659,7 @@
                 <w:sz w:val="22"/>
                 <w:szCs w:val="22"/>
               </w:rPr>
-              <w:t>(</w:t>
-            </w:r>
-            <w:proofErr w:type="gramEnd"/>
-            <w:r>
-              <w:rPr>
-                <w:rFonts w:ascii="Helvetica" w:hAnsi="Helvetica"/>
-                <w:color w:val="000000"/>
-                <w:sz w:val="22"/>
-                <w:szCs w:val="22"/>
-              </w:rPr>
-              <w:t>Richiesta))</w:t>
+              <w:t>(Richiesta))</w:t>
             </w:r>
           </w:p>
         </w:tc>
@@ -8792,7 +8855,6 @@
               <w:t xml:space="preserve"> </w:t>
             </w:r>
             <w:proofErr w:type="spellStart"/>
-            <w:proofErr w:type="gramStart"/>
             <w:r>
               <w:rPr>
                 <w:rFonts w:ascii="Helvetica" w:hAnsi="Helvetica"/>
@@ -8810,17 +8872,7 @@
                 <w:sz w:val="22"/>
                 <w:szCs w:val="22"/>
               </w:rPr>
-              <w:t>(</w:t>
-            </w:r>
-            <w:proofErr w:type="gramEnd"/>
-            <w:r>
-              <w:rPr>
-                <w:rFonts w:ascii="Helvetica" w:hAnsi="Helvetica"/>
-                <w:color w:val="000000"/>
-                <w:sz w:val="22"/>
-                <w:szCs w:val="22"/>
-              </w:rPr>
-              <w:t>Richiesta** testa, Richiesta* nuova)</w:t>
+              <w:t>(Richiesta** testa, Richiesta* nuova)</w:t>
             </w:r>
           </w:p>
         </w:tc>
@@ -9254,7 +9306,6 @@
               <w:t xml:space="preserve"> </w:t>
             </w:r>
             <w:proofErr w:type="spellStart"/>
-            <w:proofErr w:type="gramStart"/>
             <w:r>
               <w:rPr>
                 <w:rFonts w:ascii="Helvetica" w:hAnsi="Helvetica"/>
@@ -9272,17 +9323,7 @@
                 <w:sz w:val="22"/>
                 <w:szCs w:val="22"/>
               </w:rPr>
-              <w:t>(</w:t>
-            </w:r>
-            <w:proofErr w:type="gramEnd"/>
-            <w:r>
-              <w:rPr>
-                <w:rFonts w:ascii="Helvetica" w:hAnsi="Helvetica"/>
-                <w:color w:val="000000"/>
-                <w:sz w:val="22"/>
-                <w:szCs w:val="22"/>
-              </w:rPr>
-              <w:t xml:space="preserve">Richiesta* r, </w:t>
+              <w:t xml:space="preserve">(Richiesta* r, </w:t>
             </w:r>
             <w:proofErr w:type="spellStart"/>
             <w:r>
@@ -9345,7 +9386,6 @@
               <w:t xml:space="preserve"> </w:t>
             </w:r>
             <w:proofErr w:type="spellStart"/>
-            <w:proofErr w:type="gramStart"/>
             <w:r>
               <w:rPr>
                 <w:rFonts w:ascii="Helvetica" w:hAnsi="Helvetica"/>
@@ -9363,17 +9403,7 @@
                 <w:sz w:val="22"/>
                 <w:szCs w:val="22"/>
               </w:rPr>
-              <w:t>(</w:t>
-            </w:r>
-            <w:proofErr w:type="gramEnd"/>
-            <w:r>
-              <w:rPr>
-                <w:rFonts w:ascii="Helvetica" w:hAnsi="Helvetica"/>
-                <w:color w:val="000000"/>
-                <w:sz w:val="22"/>
-                <w:szCs w:val="22"/>
-              </w:rPr>
-              <w:t xml:space="preserve">Richiesta* testa, </w:t>
+              <w:t xml:space="preserve">(Richiesta* testa, </w:t>
             </w:r>
             <w:proofErr w:type="spellStart"/>
             <w:r>
@@ -9861,7 +9891,6 @@
               <w:t xml:space="preserve">Richiesta* </w:t>
             </w:r>
             <w:proofErr w:type="spellStart"/>
-            <w:proofErr w:type="gramStart"/>
             <w:r>
               <w:rPr>
                 <w:rFonts w:ascii="Helvetica" w:hAnsi="Helvetica"/>
@@ -9879,17 +9908,7 @@
                 <w:sz w:val="22"/>
                 <w:szCs w:val="22"/>
               </w:rPr>
-              <w:t>(</w:t>
-            </w:r>
-            <w:proofErr w:type="gramEnd"/>
-            <w:r>
-              <w:rPr>
-                <w:rFonts w:ascii="Helvetica" w:hAnsi="Helvetica"/>
-                <w:color w:val="000000"/>
-                <w:sz w:val="22"/>
-                <w:szCs w:val="22"/>
-              </w:rPr>
-              <w:t xml:space="preserve">Richiesta* testa, </w:t>
+              <w:t xml:space="preserve">(Richiesta* testa, </w:t>
             </w:r>
             <w:proofErr w:type="spellStart"/>
             <w:r>
@@ -10327,7 +10346,6 @@
               <w:t xml:space="preserve"> </w:t>
             </w:r>
             <w:proofErr w:type="spellStart"/>
-            <w:proofErr w:type="gramStart"/>
             <w:r>
               <w:rPr>
                 <w:rFonts w:ascii="Helvetica" w:hAnsi="Helvetica"/>
@@ -10345,17 +10363,7 @@
                 <w:sz w:val="22"/>
                 <w:szCs w:val="22"/>
               </w:rPr>
-              <w:t>(</w:t>
-            </w:r>
-            <w:proofErr w:type="gramEnd"/>
-            <w:r>
-              <w:rPr>
-                <w:rFonts w:ascii="Helvetica" w:hAnsi="Helvetica"/>
-                <w:color w:val="000000"/>
-                <w:sz w:val="22"/>
-                <w:szCs w:val="22"/>
-              </w:rPr>
-              <w:t>Richiesta* testa)</w:t>
+              <w:t>(Richiesta* testa)</w:t>
             </w:r>
           </w:p>
         </w:tc>
@@ -10656,7 +10664,21 @@
         <w:rPr>
           <w:rFonts w:ascii="Helvetica" w:hAnsi="Helvetica"/>
         </w:rPr>
-        <w:t xml:space="preserve"> Queue (Max-Heap) — Modulo Richieste</w:t>
+        <w:t xml:space="preserve"> Queue (Max-</w:t>
+      </w:r>
+      <w:proofErr w:type="spellStart"/>
+      <w:r>
+        <w:rPr>
+          <w:rFonts w:ascii="Helvetica" w:hAnsi="Helvetica"/>
+        </w:rPr>
+        <w:t>Heap</w:t>
+      </w:r>
+      <w:proofErr w:type="spellEnd"/>
+      <w:r>
+        <w:rPr>
+          <w:rFonts w:ascii="Helvetica" w:hAnsi="Helvetica"/>
+        </w:rPr>
+        <w:t>) — Modulo Richieste</w:t>
       </w:r>
     </w:p>
     <w:p>
@@ -10864,7 +10886,6 @@
               <w:t xml:space="preserve">void </w:t>
             </w:r>
             <w:proofErr w:type="spellStart"/>
-            <w:proofErr w:type="gramStart"/>
             <w:r>
               <w:rPr>
                 <w:rFonts w:ascii="Helvetica" w:hAnsi="Helvetica"/>
@@ -10887,7 +10908,6 @@
               <w:t>(</w:t>
             </w:r>
             <w:proofErr w:type="spellStart"/>
-            <w:proofErr w:type="gramEnd"/>
             <w:r>
               <w:rPr>
                 <w:rFonts w:ascii="Helvetica" w:hAnsi="Helvetica"/>
@@ -10929,10 +10949,9 @@
                 <w:szCs w:val="22"/>
                 <w:lang w:val="en-GB"/>
               </w:rPr>
-              <w:t xml:space="preserve">) int </w:t>
+              <w:t xml:space="preserve">) </w:t>
             </w:r>
             <w:proofErr w:type="spellStart"/>
-            <w:proofErr w:type="gramStart"/>
             <w:r>
               <w:rPr>
                 <w:rFonts w:ascii="Helvetica" w:hAnsi="Helvetica"/>
@@ -10941,6 +10960,28 @@
                 <w:szCs w:val="22"/>
                 <w:lang w:val="en-GB"/>
               </w:rPr>
+              <w:t>int</w:t>
+            </w:r>
+            <w:proofErr w:type="spellEnd"/>
+            <w:r>
+              <w:rPr>
+                <w:rFonts w:ascii="Helvetica" w:hAnsi="Helvetica"/>
+                <w:color w:val="000000"/>
+                <w:sz w:val="22"/>
+                <w:szCs w:val="22"/>
+                <w:lang w:val="en-GB"/>
+              </w:rPr>
+              <w:t xml:space="preserve"> </w:t>
+            </w:r>
+            <w:proofErr w:type="spellStart"/>
+            <w:r>
+              <w:rPr>
+                <w:rFonts w:ascii="Helvetica" w:hAnsi="Helvetica"/>
+                <w:color w:val="000000"/>
+                <w:sz w:val="22"/>
+                <w:szCs w:val="22"/>
+                <w:lang w:val="en-GB"/>
+              </w:rPr>
               <w:t>emptyPQ</w:t>
             </w:r>
             <w:proofErr w:type="spellEnd"/>
@@ -10955,7 +10996,6 @@
               <w:t>(</w:t>
             </w:r>
             <w:proofErr w:type="spellStart"/>
-            <w:proofErr w:type="gramEnd"/>
             <w:r>
               <w:rPr>
                 <w:rFonts w:ascii="Helvetica" w:hAnsi="Helvetica"/>
@@ -11019,10 +11059,9 @@
                 <w:szCs w:val="22"/>
                 <w:lang w:val="en-GB"/>
               </w:rPr>
-              <w:t xml:space="preserve">) int </w:t>
+              <w:t xml:space="preserve">) </w:t>
             </w:r>
             <w:proofErr w:type="spellStart"/>
-            <w:proofErr w:type="gramStart"/>
             <w:r>
               <w:rPr>
                 <w:rFonts w:ascii="Helvetica" w:hAnsi="Helvetica"/>
@@ -11031,6 +11070,28 @@
                 <w:szCs w:val="22"/>
                 <w:lang w:val="en-GB"/>
               </w:rPr>
+              <w:t>int</w:t>
+            </w:r>
+            <w:proofErr w:type="spellEnd"/>
+            <w:r>
+              <w:rPr>
+                <w:rFonts w:ascii="Helvetica" w:hAnsi="Helvetica"/>
+                <w:color w:val="000000"/>
+                <w:sz w:val="22"/>
+                <w:szCs w:val="22"/>
+                <w:lang w:val="en-GB"/>
+              </w:rPr>
+              <w:t xml:space="preserve"> </w:t>
+            </w:r>
+            <w:proofErr w:type="spellStart"/>
+            <w:r>
+              <w:rPr>
+                <w:rFonts w:ascii="Helvetica" w:hAnsi="Helvetica"/>
+                <w:color w:val="000000"/>
+                <w:sz w:val="22"/>
+                <w:szCs w:val="22"/>
+                <w:lang w:val="en-GB"/>
+              </w:rPr>
               <w:t>fullPQ</w:t>
             </w:r>
             <w:proofErr w:type="spellEnd"/>
@@ -11045,7 +11106,6 @@
               <w:t>(</w:t>
             </w:r>
             <w:proofErr w:type="spellStart"/>
-            <w:proofErr w:type="gramEnd"/>
             <w:r>
               <w:rPr>
                 <w:rFonts w:ascii="Helvetica" w:hAnsi="Helvetica"/>
@@ -11299,7 +11359,27 @@
                 <w:sz w:val="22"/>
                 <w:szCs w:val="22"/>
               </w:rPr>
-              <w:t xml:space="preserve">-&gt;size = 0. </w:t>
+              <w:t>-&gt;</w:t>
+            </w:r>
+            <w:proofErr w:type="spellStart"/>
+            <w:r>
+              <w:rPr>
+                <w:rFonts w:ascii="Helvetica" w:hAnsi="Helvetica"/>
+                <w:color w:val="000000"/>
+                <w:sz w:val="22"/>
+                <w:szCs w:val="22"/>
+              </w:rPr>
+              <w:t>size</w:t>
+            </w:r>
+            <w:proofErr w:type="spellEnd"/>
+            <w:r>
+              <w:rPr>
+                <w:rFonts w:ascii="Helvetica" w:hAnsi="Helvetica"/>
+                <w:color w:val="000000"/>
+                <w:sz w:val="22"/>
+                <w:szCs w:val="22"/>
+              </w:rPr>
+              <w:t xml:space="preserve"> = 0. </w:t>
             </w:r>
             <w:proofErr w:type="spellStart"/>
             <w:r>
@@ -11700,7 +11780,6 @@
               <w:t xml:space="preserve"> </w:t>
             </w:r>
             <w:proofErr w:type="spellStart"/>
-            <w:proofErr w:type="gramStart"/>
             <w:r>
               <w:rPr>
                 <w:rFonts w:ascii="Helvetica" w:hAnsi="Helvetica"/>
@@ -11721,7 +11800,6 @@
               <w:t>(</w:t>
             </w:r>
             <w:proofErr w:type="spellStart"/>
-            <w:proofErr w:type="gramEnd"/>
             <w:r>
               <w:rPr>
                 <w:rFonts w:ascii="Helvetica" w:hAnsi="Helvetica"/>
@@ -11847,9 +11925,9 @@
                 <w:szCs w:val="22"/>
                 <w:lang w:val="en-GB"/>
               </w:rPr>
-              <w:t xml:space="preserve"> ≠ NULL; r ≠ NULL</w:t>
-            </w:r>
-            <w:proofErr w:type="gramStart"/>
+              <w:t xml:space="preserve"> ≠ NULL; r ≠ NULL; !</w:t>
+            </w:r>
+            <w:proofErr w:type="spellStart"/>
             <w:r>
               <w:rPr>
                 <w:rFonts w:ascii="Helvetica" w:hAnsi="Helvetica"/>
@@ -11858,21 +11936,9 @@
                 <w:szCs w:val="22"/>
                 <w:lang w:val="en-GB"/>
               </w:rPr>
-              <w:t>; !</w:t>
-            </w:r>
-            <w:proofErr w:type="spellStart"/>
-            <w:r>
-              <w:rPr>
-                <w:rFonts w:ascii="Helvetica" w:hAnsi="Helvetica"/>
-                <w:color w:val="000000"/>
-                <w:sz w:val="22"/>
-                <w:szCs w:val="22"/>
-                <w:lang w:val="en-GB"/>
-              </w:rPr>
               <w:t>fullPQ</w:t>
             </w:r>
             <w:proofErr w:type="spellEnd"/>
-            <w:proofErr w:type="gramEnd"/>
             <w:r>
               <w:rPr>
                 <w:rFonts w:ascii="Helvetica" w:hAnsi="Helvetica"/>
@@ -12082,7 +12148,27 @@
                 <w:sz w:val="22"/>
                 <w:szCs w:val="22"/>
               </w:rPr>
-              <w:t>-&gt;size incrementa di 1; la posizione dei puntatori nell'array heap può cambiare</w:t>
+              <w:t>-&gt;</w:t>
+            </w:r>
+            <w:proofErr w:type="spellStart"/>
+            <w:r>
+              <w:rPr>
+                <w:rFonts w:ascii="Helvetica" w:hAnsi="Helvetica"/>
+                <w:color w:val="000000"/>
+                <w:sz w:val="22"/>
+                <w:szCs w:val="22"/>
+              </w:rPr>
+              <w:t>size</w:t>
+            </w:r>
+            <w:proofErr w:type="spellEnd"/>
+            <w:r>
+              <w:rPr>
+                <w:rFonts w:ascii="Helvetica" w:hAnsi="Helvetica"/>
+                <w:color w:val="000000"/>
+                <w:sz w:val="22"/>
+                <w:szCs w:val="22"/>
+              </w:rPr>
+              <w:t xml:space="preserve"> incrementa di 1; la posizione dei puntatori nell'array heap può cambiare</w:t>
             </w:r>
           </w:p>
         </w:tc>
@@ -12267,7 +12353,6 @@
               <w:t xml:space="preserve">Richiesta* </w:t>
             </w:r>
             <w:proofErr w:type="spellStart"/>
-            <w:proofErr w:type="gramStart"/>
             <w:r>
               <w:rPr>
                 <w:rFonts w:ascii="Helvetica" w:hAnsi="Helvetica"/>
@@ -12288,7 +12373,6 @@
               <w:t>(</w:t>
             </w:r>
             <w:proofErr w:type="spellStart"/>
-            <w:proofErr w:type="gramEnd"/>
             <w:r>
               <w:rPr>
                 <w:rFonts w:ascii="Helvetica" w:hAnsi="Helvetica"/>
@@ -12411,17 +12495,7 @@
                 <w:sz w:val="22"/>
                 <w:szCs w:val="22"/>
               </w:rPr>
-              <w:t xml:space="preserve"> ≠ NULL</w:t>
-            </w:r>
-            <w:proofErr w:type="gramStart"/>
-            <w:r>
-              <w:rPr>
-                <w:rFonts w:ascii="Helvetica" w:hAnsi="Helvetica"/>
-                <w:color w:val="000000"/>
-                <w:sz w:val="22"/>
-                <w:szCs w:val="22"/>
-              </w:rPr>
-              <w:t>; !</w:t>
+              <w:t xml:space="preserve"> ≠ NULL; !</w:t>
             </w:r>
             <w:proofErr w:type="spellStart"/>
             <w:r>
@@ -12434,7 +12508,6 @@
               <w:t>emptyPQ</w:t>
             </w:r>
             <w:proofErr w:type="spellEnd"/>
-            <w:proofErr w:type="gramEnd"/>
             <w:r>
               <w:rPr>
                 <w:rFonts w:ascii="Helvetica" w:hAnsi="Helvetica"/>
@@ -12596,7 +12669,27 @@
                 <w:sz w:val="22"/>
                 <w:szCs w:val="22"/>
               </w:rPr>
-              <w:t>-&gt;size decrementa di 1. Restituisce NULL se coda vuota.</w:t>
+              <w:t>-&gt;</w:t>
+            </w:r>
+            <w:proofErr w:type="spellStart"/>
+            <w:r>
+              <w:rPr>
+                <w:rFonts w:ascii="Helvetica" w:hAnsi="Helvetica"/>
+                <w:color w:val="000000"/>
+                <w:sz w:val="22"/>
+                <w:szCs w:val="22"/>
+              </w:rPr>
+              <w:t>size</w:t>
+            </w:r>
+            <w:proofErr w:type="spellEnd"/>
+            <w:r>
+              <w:rPr>
+                <w:rFonts w:ascii="Helvetica" w:hAnsi="Helvetica"/>
+                <w:color w:val="000000"/>
+                <w:sz w:val="22"/>
+                <w:szCs w:val="22"/>
+              </w:rPr>
+              <w:t xml:space="preserve"> decrementa di 1. Restituisce NULL se coda vuota.</w:t>
             </w:r>
           </w:p>
         </w:tc>
@@ -12681,7 +12774,27 @@
                 <w:sz w:val="22"/>
                 <w:szCs w:val="22"/>
               </w:rPr>
-              <w:t>-&gt;size decrementa; i puntatori nell'array heap sono riorganizzati</w:t>
+              <w:t>-&gt;</w:t>
+            </w:r>
+            <w:proofErr w:type="spellStart"/>
+            <w:r>
+              <w:rPr>
+                <w:rFonts w:ascii="Helvetica" w:hAnsi="Helvetica"/>
+                <w:color w:val="000000"/>
+                <w:sz w:val="22"/>
+                <w:szCs w:val="22"/>
+              </w:rPr>
+              <w:t>size</w:t>
+            </w:r>
+            <w:proofErr w:type="spellEnd"/>
+            <w:r>
+              <w:rPr>
+                <w:rFonts w:ascii="Helvetica" w:hAnsi="Helvetica"/>
+                <w:color w:val="000000"/>
+                <w:sz w:val="22"/>
+                <w:szCs w:val="22"/>
+              </w:rPr>
+              <w:t xml:space="preserve"> decrementa; i puntatori nell'array heap sono riorganizzati</w:t>
             </w:r>
           </w:p>
         </w:tc>
@@ -12916,7 +13029,6 @@
               <w:t xml:space="preserve"> </w:t>
             </w:r>
             <w:proofErr w:type="spellStart"/>
-            <w:proofErr w:type="gramStart"/>
             <w:r>
               <w:rPr>
                 <w:rFonts w:ascii="Helvetica" w:hAnsi="Helvetica"/>
@@ -12937,7 +13049,6 @@
               <w:t>(</w:t>
             </w:r>
             <w:proofErr w:type="spellStart"/>
-            <w:proofErr w:type="gramEnd"/>
             <w:r>
               <w:rPr>
                 <w:rFonts w:ascii="Helvetica" w:hAnsi="Helvetica"/>
@@ -12978,7 +13089,6 @@
               <w:t xml:space="preserve"> </w:t>
             </w:r>
             <w:proofErr w:type="spellStart"/>
-            <w:proofErr w:type="gramStart"/>
             <w:r>
               <w:rPr>
                 <w:rFonts w:ascii="Helvetica" w:hAnsi="Helvetica"/>
@@ -12999,7 +13109,6 @@
               <w:t>(</w:t>
             </w:r>
             <w:proofErr w:type="spellStart"/>
-            <w:proofErr w:type="gramEnd"/>
             <w:r>
               <w:rPr>
                 <w:rFonts w:ascii="Helvetica" w:hAnsi="Helvetica"/>
@@ -13536,7 +13645,6 @@
               <w:t xml:space="preserve"> </w:t>
             </w:r>
             <w:proofErr w:type="spellStart"/>
-            <w:proofErr w:type="gramStart"/>
             <w:r>
               <w:rPr>
                 <w:rFonts w:ascii="Helvetica" w:hAnsi="Helvetica"/>
@@ -13557,7 +13665,6 @@
               <w:t>(</w:t>
             </w:r>
             <w:proofErr w:type="spellStart"/>
-            <w:proofErr w:type="gramEnd"/>
             <w:r>
               <w:rPr>
                 <w:rFonts w:ascii="Helvetica" w:hAnsi="Helvetica"/>
@@ -14093,7 +14200,6 @@
               <w:t xml:space="preserve"> </w:t>
             </w:r>
             <w:proofErr w:type="spellStart"/>
-            <w:proofErr w:type="gramStart"/>
             <w:r>
               <w:rPr>
                 <w:rFonts w:ascii="Helvetica" w:hAnsi="Helvetica"/>
@@ -14114,7 +14220,6 @@
               <w:t>(</w:t>
             </w:r>
             <w:proofErr w:type="spellStart"/>
-            <w:proofErr w:type="gramEnd"/>
             <w:r>
               <w:rPr>
                 <w:rFonts w:ascii="Helvetica" w:hAnsi="Helvetica"/>
@@ -14591,7 +14696,6 @@
               <w:t xml:space="preserve"> </w:t>
             </w:r>
             <w:proofErr w:type="spellStart"/>
-            <w:proofErr w:type="gramStart"/>
             <w:r>
               <w:rPr>
                 <w:rFonts w:ascii="Helvetica" w:hAnsi="Helvetica"/>
@@ -14609,17 +14713,27 @@
                 <w:sz w:val="22"/>
                 <w:szCs w:val="22"/>
               </w:rPr>
-              <w:t>(</w:t>
-            </w:r>
-            <w:proofErr w:type="gramEnd"/>
-            <w:r>
-              <w:rPr>
-                <w:rFonts w:ascii="Helvetica" w:hAnsi="Helvetica"/>
-                <w:color w:val="000000"/>
-                <w:sz w:val="22"/>
-                <w:szCs w:val="22"/>
-              </w:rPr>
-              <w:t>Schedule root, Data target)</w:t>
+              <w:t xml:space="preserve">(Schedule </w:t>
+            </w:r>
+            <w:proofErr w:type="spellStart"/>
+            <w:r>
+              <w:rPr>
+                <w:rFonts w:ascii="Helvetica" w:hAnsi="Helvetica"/>
+                <w:color w:val="000000"/>
+                <w:sz w:val="22"/>
+                <w:szCs w:val="22"/>
+              </w:rPr>
+              <w:t>root</w:t>
+            </w:r>
+            <w:proofErr w:type="spellEnd"/>
+            <w:r>
+              <w:rPr>
+                <w:rFonts w:ascii="Helvetica" w:hAnsi="Helvetica"/>
+                <w:color w:val="000000"/>
+                <w:sz w:val="22"/>
+                <w:szCs w:val="22"/>
+              </w:rPr>
+              <w:t>, Data target)</w:t>
             </w:r>
           </w:p>
         </w:tc>
@@ -15068,7 +15182,6 @@
               <w:t xml:space="preserve">Schedule </w:t>
             </w:r>
             <w:proofErr w:type="spellStart"/>
-            <w:proofErr w:type="gramStart"/>
             <w:r>
               <w:rPr>
                 <w:rFonts w:ascii="Helvetica" w:hAnsi="Helvetica"/>
@@ -15086,17 +15199,7 @@
                 <w:sz w:val="22"/>
                 <w:szCs w:val="22"/>
               </w:rPr>
-              <w:t>(</w:t>
-            </w:r>
-            <w:proofErr w:type="gramEnd"/>
-            <w:r>
-              <w:rPr>
-                <w:rFonts w:ascii="Helvetica" w:hAnsi="Helvetica"/>
-                <w:color w:val="000000"/>
-                <w:sz w:val="22"/>
-                <w:szCs w:val="22"/>
-              </w:rPr>
-              <w:t xml:space="preserve">Schedule root, Richiesta </w:t>
+              <w:t xml:space="preserve">(Schedule </w:t>
             </w:r>
             <w:proofErr w:type="spellStart"/>
             <w:r>
@@ -15106,6 +15209,26 @@
                 <w:sz w:val="22"/>
                 <w:szCs w:val="22"/>
               </w:rPr>
+              <w:t>root</w:t>
+            </w:r>
+            <w:proofErr w:type="spellEnd"/>
+            <w:r>
+              <w:rPr>
+                <w:rFonts w:ascii="Helvetica" w:hAnsi="Helvetica"/>
+                <w:color w:val="000000"/>
+                <w:sz w:val="22"/>
+                <w:szCs w:val="22"/>
+              </w:rPr>
+              <w:t xml:space="preserve">, Richiesta </w:t>
+            </w:r>
+            <w:proofErr w:type="spellStart"/>
+            <w:r>
+              <w:rPr>
+                <w:rFonts w:ascii="Helvetica" w:hAnsi="Helvetica"/>
+                <w:color w:val="000000"/>
+                <w:sz w:val="22"/>
+                <w:szCs w:val="22"/>
+              </w:rPr>
               <w:t>req</w:t>
             </w:r>
             <w:proofErr w:type="spellEnd"/>
@@ -15116,7 +15239,27 @@
                 <w:sz w:val="22"/>
                 <w:szCs w:val="22"/>
               </w:rPr>
-              <w:t xml:space="preserve">, Tecnico* tec, Data </w:t>
+              <w:t xml:space="preserve">, Tecnico* </w:t>
+            </w:r>
+            <w:proofErr w:type="spellStart"/>
+            <w:r>
+              <w:rPr>
+                <w:rFonts w:ascii="Helvetica" w:hAnsi="Helvetica"/>
+                <w:color w:val="000000"/>
+                <w:sz w:val="22"/>
+                <w:szCs w:val="22"/>
+              </w:rPr>
+              <w:t>tec</w:t>
+            </w:r>
+            <w:proofErr w:type="spellEnd"/>
+            <w:r>
+              <w:rPr>
+                <w:rFonts w:ascii="Helvetica" w:hAnsi="Helvetica"/>
+                <w:color w:val="000000"/>
+                <w:sz w:val="22"/>
+                <w:szCs w:val="22"/>
+              </w:rPr>
+              <w:t xml:space="preserve">, Data </w:t>
             </w:r>
             <w:proofErr w:type="spellStart"/>
             <w:r>
@@ -15244,7 +15387,6 @@
               <w:t xml:space="preserve">; </w:t>
             </w:r>
             <w:proofErr w:type="spellStart"/>
-            <w:proofErr w:type="gramStart"/>
             <w:r>
               <w:rPr>
                 <w:rFonts w:ascii="Helvetica" w:hAnsi="Helvetica"/>
@@ -15264,15 +15406,25 @@
               </w:rPr>
               <w:t>(</w:t>
             </w:r>
-            <w:proofErr w:type="gramEnd"/>
-            <w:r>
-              <w:rPr>
-                <w:rFonts w:ascii="Helvetica" w:hAnsi="Helvetica"/>
-                <w:color w:val="000000"/>
-                <w:sz w:val="22"/>
-                <w:szCs w:val="22"/>
-              </w:rPr>
-              <w:t>root, data) = 0</w:t>
+            <w:proofErr w:type="spellStart"/>
+            <w:r>
+              <w:rPr>
+                <w:rFonts w:ascii="Helvetica" w:hAnsi="Helvetica"/>
+                <w:color w:val="000000"/>
+                <w:sz w:val="22"/>
+                <w:szCs w:val="22"/>
+              </w:rPr>
+              <w:t>root</w:t>
+            </w:r>
+            <w:proofErr w:type="spellEnd"/>
+            <w:r>
+              <w:rPr>
+                <w:rFonts w:ascii="Helvetica" w:hAnsi="Helvetica"/>
+                <w:color w:val="000000"/>
+                <w:sz w:val="22"/>
+                <w:szCs w:val="22"/>
+              </w:rPr>
+              <w:t>, data) = 0</w:t>
             </w:r>
           </w:p>
         </w:tc>
@@ -15445,7 +15597,6 @@
               <w:t>Alloca memoria per il nuovo nodo (</w:t>
             </w:r>
             <w:proofErr w:type="spellStart"/>
-            <w:proofErr w:type="gramStart"/>
             <w:r>
               <w:rPr>
                 <w:rFonts w:ascii="Helvetica" w:hAnsi="Helvetica"/>
@@ -15466,7 +15617,6 @@
               <w:t>(</w:t>
             </w:r>
             <w:proofErr w:type="spellStart"/>
-            <w:proofErr w:type="gramEnd"/>
             <w:r>
               <w:rPr>
                 <w:rFonts w:ascii="Helvetica" w:hAnsi="Helvetica"/>
@@ -15691,7 +15841,6 @@
               <w:t xml:space="preserve">void </w:t>
             </w:r>
             <w:proofErr w:type="spellStart"/>
-            <w:proofErr w:type="gramStart"/>
             <w:r>
               <w:rPr>
                 <w:rFonts w:ascii="Helvetica" w:hAnsi="Helvetica"/>
@@ -15711,18 +15860,7 @@
                 <w:szCs w:val="22"/>
                 <w:lang w:val="en-GB"/>
               </w:rPr>
-              <w:t>(</w:t>
-            </w:r>
-            <w:proofErr w:type="gramEnd"/>
-            <w:r>
-              <w:rPr>
-                <w:rFonts w:ascii="Helvetica" w:hAnsi="Helvetica"/>
-                <w:color w:val="000000"/>
-                <w:sz w:val="22"/>
-                <w:szCs w:val="22"/>
-                <w:lang w:val="en-GB"/>
-              </w:rPr>
-              <w:t>Schedule root, FILE* out)</w:t>
+              <w:t>(Schedule root, FILE* out)</w:t>
             </w:r>
           </w:p>
         </w:tc>
@@ -15816,7 +15954,27 @@
                 <w:sz w:val="22"/>
                 <w:szCs w:val="22"/>
               </w:rPr>
-              <w:t xml:space="preserve"> CONCLUSA hanno tec ≠ NULL</w:t>
+              <w:t xml:space="preserve"> CONCLUSA hanno </w:t>
+            </w:r>
+            <w:proofErr w:type="spellStart"/>
+            <w:r>
+              <w:rPr>
+                <w:rFonts w:ascii="Helvetica" w:hAnsi="Helvetica"/>
+                <w:color w:val="000000"/>
+                <w:sz w:val="22"/>
+                <w:szCs w:val="22"/>
+              </w:rPr>
+              <w:t>tec</w:t>
+            </w:r>
+            <w:proofErr w:type="spellEnd"/>
+            <w:r>
+              <w:rPr>
+                <w:rFonts w:ascii="Helvetica" w:hAnsi="Helvetica"/>
+                <w:color w:val="000000"/>
+                <w:sz w:val="22"/>
+                <w:szCs w:val="22"/>
+              </w:rPr>
+              <w:t xml:space="preserve"> ≠ NULL</w:t>
             </w:r>
           </w:p>
         </w:tc>
@@ -16211,7 +16369,6 @@
               <w:t xml:space="preserve"> </w:t>
             </w:r>
             <w:proofErr w:type="spellStart"/>
-            <w:proofErr w:type="gramStart"/>
             <w:r>
               <w:rPr>
                 <w:rFonts w:ascii="Helvetica" w:hAnsi="Helvetica"/>
@@ -16229,17 +16386,27 @@
                 <w:sz w:val="22"/>
                 <w:szCs w:val="22"/>
               </w:rPr>
-              <w:t>(</w:t>
-            </w:r>
-            <w:proofErr w:type="gramEnd"/>
-            <w:r>
-              <w:rPr>
-                <w:rFonts w:ascii="Helvetica" w:hAnsi="Helvetica"/>
-                <w:color w:val="000000"/>
-                <w:sz w:val="22"/>
-                <w:szCs w:val="22"/>
-              </w:rPr>
-              <w:t>Schedule root)</w:t>
+              <w:t xml:space="preserve">(Schedule </w:t>
+            </w:r>
+            <w:proofErr w:type="spellStart"/>
+            <w:r>
+              <w:rPr>
+                <w:rFonts w:ascii="Helvetica" w:hAnsi="Helvetica"/>
+                <w:color w:val="000000"/>
+                <w:sz w:val="22"/>
+                <w:szCs w:val="22"/>
+              </w:rPr>
+              <w:t>root</w:t>
+            </w:r>
+            <w:proofErr w:type="spellEnd"/>
+            <w:r>
+              <w:rPr>
+                <w:rFonts w:ascii="Helvetica" w:hAnsi="Helvetica"/>
+                <w:color w:val="000000"/>
+                <w:sz w:val="22"/>
+                <w:szCs w:val="22"/>
+              </w:rPr>
+              <w:t>)</w:t>
             </w:r>
           </w:p>
         </w:tc>
@@ -19135,7 +19302,6 @@
                 <w:rFonts w:ascii="Helvetica" w:hAnsi="Helvetica"/>
               </w:rPr>
             </w:pPr>
-            <w:proofErr w:type="gramStart"/>
             <w:r>
               <w:rPr>
                 <w:rFonts w:ascii="Helvetica" w:hAnsi="Helvetica"/>
@@ -19145,7 +19311,6 @@
               </w:rPr>
               <w:t>Storico interventi conclusi</w:t>
             </w:r>
-            <w:proofErr w:type="gramEnd"/>
           </w:p>
         </w:tc>
         <w:tc>
@@ -19491,21 +19656,7 @@
         <w:rPr>
           <w:rFonts w:ascii="Helvetica" w:hAnsi="Helvetica"/>
         </w:rPr>
-        <w:t xml:space="preserve">I test sono progettati per coprire sia i percorsi attesi (happy </w:t>
-      </w:r>
-      <w:proofErr w:type="spellStart"/>
-      <w:r>
-        <w:rPr>
-          <w:rFonts w:ascii="Helvetica" w:hAnsi="Helvetica"/>
-        </w:rPr>
-        <w:t>path</w:t>
-      </w:r>
-      <w:proofErr w:type="spellEnd"/>
-      <w:r>
-        <w:rPr>
-          <w:rFonts w:ascii="Helvetica" w:hAnsi="Helvetica"/>
-        </w:rPr>
-        <w:t>) sia i casi limite: lista vuota, codice inesistente, transizione di stato invalida, conflitto di pianificazione, lista tecnici vuota. L'approccio black-box confronta l'output del programma con un oracolo predefinito, garantendo la riproducibilità automatica su qualsiasi piattaforma.</w:t>
+        <w:t>I test sono progettati per coprire sia i percorsi attesi sia i casi limite: lista vuota, codice inesistente, transizione di stato invalida, conflitto di pianificazione, lista tecnici vuota. L'approccio black-box confronta l'output del programma con un oracolo predefinito, garantendo la riproducibilità automatica su qualsiasi piattaforma.</w:t>
       </w:r>
     </w:p>
     <w:p>
@@ -19534,6 +19685,7 @@
       <w:r>
         <w:rPr>
           <w:rFonts w:ascii="Helvetica" w:hAnsi="Helvetica"/>
+          <w:i/>
         </w:rPr>
         <w:t>confrontaFile</w:t>
       </w:r>
@@ -20079,25 +20231,7 @@
                   <w:sz w:val="22"/>
                   <w:szCs w:val="22"/>
                 </w:rPr>
-                <w:t>[link GitHub pu</w:t>
-              </w:r>
-              <w:r>
-                <w:rPr>
-                  <w:rStyle w:val="Collegamentoipertestuale"/>
-                  <w:rFonts w:ascii="Helvetica" w:hAnsi="Helvetica"/>
-                  <w:sz w:val="22"/>
-                  <w:szCs w:val="22"/>
-                </w:rPr>
-                <w:t>b</w:t>
-              </w:r>
-              <w:r>
-                <w:rPr>
-                  <w:rStyle w:val="Collegamentoipertestuale"/>
-                  <w:rFonts w:ascii="Helvetica" w:hAnsi="Helvetica"/>
-                  <w:sz w:val="22"/>
-                  <w:szCs w:val="22"/>
-                </w:rPr>
-                <w:t>blico]</w:t>
+                <w:t>[link GitHub pubblico]</w:t>
               </w:r>
             </w:hyperlink>
           </w:p>
@@ -20172,8 +20306,10 @@
                 <w:sz w:val="22"/>
                 <w:szCs w:val="22"/>
               </w:rPr>
-              <w:t>29 maggio 2025</w:t>
-            </w:r>
+              <w:t>29 maggio 2026</w:t>
+            </w:r>
+            <w:bookmarkStart w:id="0" w:name="_GoBack"/>
+            <w:bookmarkEnd w:id="0"/>
           </w:p>
         </w:tc>
       </w:tr>
@@ -20261,7 +20397,7 @@
 </file>
 
 <file path=word/endnotes.xml><?xml version="1.0" encoding="utf-8"?>
-<w:endnotes xmlns:wpc="http://schemas.microsoft.com/office/word/2010/wordprocessingCanvas" xmlns:cx="http://schemas.microsoft.com/office/drawing/2014/chartex" xmlns:cx1="http://schemas.microsoft.com/office/drawing/2015/9/8/chartex" xmlns:cx2="http://schemas.microsoft.com/office/drawing/2015/10/21/chartex" xmlns:cx3="http://schemas.microsoft.com/office/drawing/2016/5/9/chartex" xmlns:cx4="http://schemas.microsoft.com/office/drawing/2016/5/10/chartex" xmlns:cx5="http://schemas.microsoft.com/office/drawing/2016/5/11/chartex" xmlns:cx6="http://schemas.microsoft.com/office/drawing/2016/5/12/chartex" xmlns:cx7="http://schemas.microsoft.com/office/drawing/2016/5/13/chartex" xmlns:cx8="http://schemas.microsoft.com/office/drawing/2016/5/14/chartex" xmlns:mc="http://schemas.openxmlformats.org/markup-compatibility/2006" xmlns:aink="http://schemas.microsoft.com/office/drawing/2016/ink" xmlns:am3d="http://schemas.microsoft.com/office/drawing/2017/model3d" xmlns:o="urn:schemas-microsoft-com:office:office" xmlns:oel="http://schemas.microsoft.com/office/2019/extlst" xmlns:r="http://schemas.openxmlformats.org/officeDocument/2006/relationships" xmlns:m="http://schemas.openxmlformats.org/officeDocument/2006/math" xmlns:v="urn:schemas-microsoft-com:vml" xmlns:wp14="http://schemas.microsoft.com/office/word/2010/wordprocessingDrawing" xmlns:wp="http://schemas.openxmlformats.org/drawingml/2006/wordprocessingDrawing" xmlns:w10="urn:schemas-microsoft-com:office:word" xmlns:w="http://schemas.openxmlformats.org/wordprocessingml/2006/main" xmlns:w14="http://schemas.microsoft.com/office/word/2010/wordml" xmlns:w15="http://schemas.microsoft.com/office/word/2012/wordml" xmlns:w16cex="http://schemas.microsoft.com/office/word/2018/wordml/cex" xmlns:w16cid="http://schemas.microsoft.com/office/word/2016/wordml/cid" xmlns:w16="http://schemas.microsoft.com/office/word/2018/wordml" xmlns:w16du="http://schemas.microsoft.com/office/word/2023/wordml/word16du" xmlns:w16sdtdh="http://schemas.microsoft.com/office/word/2020/wordml/sdtdatahash" xmlns:w16sdtfl="http://schemas.microsoft.com/office/word/2024/wordml/sdtformatlock" xmlns:w16se="http://schemas.microsoft.com/office/word/2015/wordml/symex" xmlns:wpg="http://schemas.microsoft.com/office/word/2010/wordprocessingGroup" xmlns:wpi="http://schemas.microsoft.com/office/word/2010/wordprocessingInk" xmlns:wne="http://schemas.microsoft.com/office/word/2006/wordml" xmlns:wps="http://schemas.microsoft.com/office/word/2010/wordprocessingShape" mc:Ignorable="w14 w15 w16se w16cid w16 w16cex w16sdtdh w16sdtfl w16du wp14">
+<w:endnotes xmlns:wpc="http://schemas.microsoft.com/office/word/2010/wordprocessingCanvas" xmlns:cx="http://schemas.microsoft.com/office/drawing/2014/chartex" xmlns:mc="http://schemas.openxmlformats.org/markup-compatibility/2006" xmlns:o="urn:schemas-microsoft-com:office:office" xmlns:r="http://schemas.openxmlformats.org/officeDocument/2006/relationships" xmlns:m="http://schemas.openxmlformats.org/officeDocument/2006/math" xmlns:v="urn:schemas-microsoft-com:vml" xmlns:wp14="http://schemas.microsoft.com/office/word/2010/wordprocessingDrawing" xmlns:wp="http://schemas.openxmlformats.org/drawingml/2006/wordprocessingDrawing" xmlns:w10="urn:schemas-microsoft-com:office:word" xmlns:w="http://schemas.openxmlformats.org/wordprocessingml/2006/main" xmlns:w14="http://schemas.microsoft.com/office/word/2010/wordml" xmlns:w15="http://schemas.microsoft.com/office/word/2012/wordml" xmlns:w16se="http://schemas.microsoft.com/office/word/2015/wordml/symex" xmlns:wpg="http://schemas.microsoft.com/office/word/2010/wordprocessingGroup" xmlns:wpi="http://schemas.microsoft.com/office/word/2010/wordprocessingInk" xmlns:wne="http://schemas.microsoft.com/office/word/2006/wordml" xmlns:wps="http://schemas.microsoft.com/office/word/2010/wordprocessingShape" mc:Ignorable="w14 w15 w16se wp14">
   <w:endnote w:type="separator" w:id="-1">
     <w:p>
       <w:r>
@@ -20280,7 +20416,7 @@
 </file>
 
 <file path=word/footer1.xml><?xml version="1.0" encoding="utf-8"?>
-<w:ftr xmlns:wpc="http://schemas.microsoft.com/office/word/2010/wordprocessingCanvas" xmlns:cx="http://schemas.microsoft.com/office/drawing/2014/chartex" xmlns:cx1="http://schemas.microsoft.com/office/drawing/2015/9/8/chartex" xmlns:cx2="http://schemas.microsoft.com/office/drawing/2015/10/21/chartex" xmlns:cx3="http://schemas.microsoft.com/office/drawing/2016/5/9/chartex" xmlns:cx4="http://schemas.microsoft.com/office/drawing/2016/5/10/chartex" xmlns:cx5="http://schemas.microsoft.com/office/drawing/2016/5/11/chartex" xmlns:cx6="http://schemas.microsoft.com/office/drawing/2016/5/12/chartex" xmlns:cx7="http://schemas.microsoft.com/office/drawing/2016/5/13/chartex" xmlns:cx8="http://schemas.microsoft.com/office/drawing/2016/5/14/chartex" xmlns:mc="http://schemas.openxmlformats.org/markup-compatibility/2006" xmlns:aink="http://schemas.microsoft.com/office/drawing/2016/ink" xmlns:am3d="http://schemas.microsoft.com/office/drawing/2017/model3d" xmlns:o="urn:schemas-microsoft-com:office:office" xmlns:oel="http://schemas.microsoft.com/office/2019/extlst" xmlns:r="http://schemas.openxmlformats.org/officeDocument/2006/relationships" xmlns:m="http://schemas.openxmlformats.org/officeDocument/2006/math" xmlns:v="urn:schemas-microsoft-com:vml" xmlns:wp14="http://schemas.microsoft.com/office/word/2010/wordprocessingDrawing" xmlns:wp="http://schemas.openxmlformats.org/drawingml/2006/wordprocessingDrawing" xmlns:w10="urn:schemas-microsoft-com:office:word" xmlns:w="http://schemas.openxmlformats.org/wordprocessingml/2006/main" xmlns:w14="http://schemas.microsoft.com/office/word/2010/wordml" xmlns:w15="http://schemas.microsoft.com/office/word/2012/wordml" xmlns:w16cex="http://schemas.microsoft.com/office/word/2018/wordml/cex" xmlns:w16cid="http://schemas.microsoft.com/office/word/2016/wordml/cid" xmlns:w16="http://schemas.microsoft.com/office/word/2018/wordml" xmlns:w16du="http://schemas.microsoft.com/office/word/2023/wordml/word16du" xmlns:w16sdtdh="http://schemas.microsoft.com/office/word/2020/wordml/sdtdatahash" xmlns:w16sdtfl="http://schemas.microsoft.com/office/word/2024/wordml/sdtformatlock" xmlns:w16se="http://schemas.microsoft.com/office/word/2015/wordml/symex" xmlns:wpg="http://schemas.microsoft.com/office/word/2010/wordprocessingGroup" xmlns:wpi="http://schemas.microsoft.com/office/word/2010/wordprocessingInk" xmlns:wne="http://schemas.microsoft.com/office/word/2006/wordml" xmlns:wps="http://schemas.microsoft.com/office/word/2010/wordprocessingShape" mc:Ignorable="w14 w15 w16se w16cid w16 w16cex w16sdtdh w16sdtfl w16du wp14">
+<w:ftr xmlns:wpc="http://schemas.microsoft.com/office/word/2010/wordprocessingCanvas" xmlns:cx="http://schemas.microsoft.com/office/drawing/2014/chartex" xmlns:mc="http://schemas.openxmlformats.org/markup-compatibility/2006" xmlns:o="urn:schemas-microsoft-com:office:office" xmlns:r="http://schemas.openxmlformats.org/officeDocument/2006/relationships" xmlns:m="http://schemas.openxmlformats.org/officeDocument/2006/math" xmlns:v="urn:schemas-microsoft-com:vml" xmlns:wp14="http://schemas.microsoft.com/office/word/2010/wordprocessingDrawing" xmlns:wp="http://schemas.openxmlformats.org/drawingml/2006/wordprocessingDrawing" xmlns:w10="urn:schemas-microsoft-com:office:word" xmlns:w="http://schemas.openxmlformats.org/wordprocessingml/2006/main" xmlns:w14="http://schemas.microsoft.com/office/word/2010/wordml" xmlns:w15="http://schemas.microsoft.com/office/word/2012/wordml" xmlns:w16se="http://schemas.microsoft.com/office/word/2015/wordml/symex" xmlns:wpg="http://schemas.microsoft.com/office/word/2010/wordprocessingGroup" xmlns:wpi="http://schemas.microsoft.com/office/word/2010/wordprocessingInk" xmlns:wne="http://schemas.microsoft.com/office/word/2006/wordml" xmlns:wps="http://schemas.microsoft.com/office/word/2010/wordprocessingShape" mc:Ignorable="w14 w15 w16se wp14">
   <w:p>
     <w:pPr>
       <w:jc w:val="center"/>
@@ -20291,25 +20427,7 @@
         <w:sz w:val="18"/>
         <w:szCs w:val="18"/>
       </w:rPr>
-      <w:t xml:space="preserve">Sistema di Gestione Manutenzione </w:t>
-    </w:r>
-    <w:proofErr w:type="gramStart"/>
-    <w:r>
-      <w:rPr>
-        <w:color w:val="888888"/>
-        <w:sz w:val="18"/>
-        <w:szCs w:val="18"/>
-      </w:rPr>
-      <w:t>Condominio  —</w:t>
-    </w:r>
-    <w:proofErr w:type="gramEnd"/>
-    <w:r>
-      <w:rPr>
-        <w:color w:val="888888"/>
-        <w:sz w:val="18"/>
-        <w:szCs w:val="18"/>
-      </w:rPr>
-      <w:t xml:space="preserve">  </w:t>
+      <w:t xml:space="preserve">Sistema di Gestione Manutenzione Condominio  —  </w:t>
     </w:r>
     <w:r>
       <w:rPr>
@@ -20342,7 +20460,7 @@
         <w:sz w:val="18"/>
         <w:szCs w:val="18"/>
       </w:rPr>
-      <w:t>1</w:t>
+      <w:t>16</w:t>
     </w:r>
     <w:r>
       <w:rPr>
@@ -20357,7 +20475,7 @@
 </file>
 
 <file path=word/footnotes.xml><?xml version="1.0" encoding="utf-8"?>
-<w:footnotes xmlns:wpc="http://schemas.microsoft.com/office/word/2010/wordprocessingCanvas" xmlns:cx="http://schemas.microsoft.com/office/drawing/2014/chartex" xmlns:cx1="http://schemas.microsoft.com/office/drawing/2015/9/8/chartex" xmlns:cx2="http://schemas.microsoft.com/office/drawing/2015/10/21/chartex" xmlns:cx3="http://schemas.microsoft.com/office/drawing/2016/5/9/chartex" xmlns:cx4="http://schemas.microsoft.com/office/drawing/2016/5/10/chartex" xmlns:cx5="http://schemas.microsoft.com/office/drawing/2016/5/11/chartex" xmlns:cx6="http://schemas.microsoft.com/office/drawing/2016/5/12/chartex" xmlns:cx7="http://schemas.microsoft.com/office/drawing/2016/5/13/chartex" xmlns:cx8="http://schemas.microsoft.com/office/drawing/2016/5/14/chartex" xmlns:mc="http://schemas.openxmlformats.org/markup-compatibility/2006" xmlns:aink="http://schemas.microsoft.com/office/drawing/2016/ink" xmlns:am3d="http://schemas.microsoft.com/office/drawing/2017/model3d" xmlns:o="urn:schemas-microsoft-com:office:office" xmlns:oel="http://schemas.microsoft.com/office/2019/extlst" xmlns:r="http://schemas.openxmlformats.org/officeDocument/2006/relationships" xmlns:m="http://schemas.openxmlformats.org/officeDocument/2006/math" xmlns:v="urn:schemas-microsoft-com:vml" xmlns:wp14="http://schemas.microsoft.com/office/word/2010/wordprocessingDrawing" xmlns:wp="http://schemas.openxmlformats.org/drawingml/2006/wordprocessingDrawing" xmlns:w10="urn:schemas-microsoft-com:office:word" xmlns:w="http://schemas.openxmlformats.org/wordprocessingml/2006/main" xmlns:w14="http://schemas.microsoft.com/office/word/2010/wordml" xmlns:w15="http://schemas.microsoft.com/office/word/2012/wordml" xmlns:w16cex="http://schemas.microsoft.com/office/word/2018/wordml/cex" xmlns:w16cid="http://schemas.microsoft.com/office/word/2016/wordml/cid" xmlns:w16="http://schemas.microsoft.com/office/word/2018/wordml" xmlns:w16du="http://schemas.microsoft.com/office/word/2023/wordml/word16du" xmlns:w16sdtdh="http://schemas.microsoft.com/office/word/2020/wordml/sdtdatahash" xmlns:w16sdtfl="http://schemas.microsoft.com/office/word/2024/wordml/sdtformatlock" xmlns:w16se="http://schemas.microsoft.com/office/word/2015/wordml/symex" xmlns:wpg="http://schemas.microsoft.com/office/word/2010/wordprocessingGroup" xmlns:wpi="http://schemas.microsoft.com/office/word/2010/wordprocessingInk" xmlns:wne="http://schemas.microsoft.com/office/word/2006/wordml" xmlns:wps="http://schemas.microsoft.com/office/word/2010/wordprocessingShape" mc:Ignorable="w14 w15 w16se w16cid w16 w16cex w16sdtdh w16sdtfl w16du wp14">
+<w:footnotes xmlns:wpc="http://schemas.microsoft.com/office/word/2010/wordprocessingCanvas" xmlns:cx="http://schemas.microsoft.com/office/drawing/2014/chartex" xmlns:mc="http://schemas.openxmlformats.org/markup-compatibility/2006" xmlns:o="urn:schemas-microsoft-com:office:office" xmlns:r="http://schemas.openxmlformats.org/officeDocument/2006/relationships" xmlns:m="http://schemas.openxmlformats.org/officeDocument/2006/math" xmlns:v="urn:schemas-microsoft-com:vml" xmlns:wp14="http://schemas.microsoft.com/office/word/2010/wordprocessingDrawing" xmlns:wp="http://schemas.openxmlformats.org/drawingml/2006/wordprocessingDrawing" xmlns:w10="urn:schemas-microsoft-com:office:word" xmlns:w="http://schemas.openxmlformats.org/wordprocessingml/2006/main" xmlns:w14="http://schemas.microsoft.com/office/word/2010/wordml" xmlns:w15="http://schemas.microsoft.com/office/word/2012/wordml" xmlns:w16se="http://schemas.microsoft.com/office/word/2015/wordml/symex" xmlns:wpg="http://schemas.microsoft.com/office/word/2010/wordprocessingGroup" xmlns:wpi="http://schemas.microsoft.com/office/word/2010/wordprocessingInk" xmlns:wne="http://schemas.microsoft.com/office/word/2006/wordml" xmlns:wps="http://schemas.microsoft.com/office/word/2010/wordprocessingShape" mc:Ignorable="w14 w15 w16se wp14">
   <w:footnote w:type="separator" w:id="-1">
     <w:p>
       <w:r>
@@ -20376,7 +20494,7 @@
 </file>
 
 <file path=word/numbering.xml><?xml version="1.0" encoding="utf-8"?>
-<w:numbering xmlns:wpc="http://schemas.microsoft.com/office/word/2010/wordprocessingCanvas" xmlns:cx="http://schemas.microsoft.com/office/drawing/2014/chartex" xmlns:cx1="http://schemas.microsoft.com/office/drawing/2015/9/8/chartex" xmlns:cx2="http://schemas.microsoft.com/office/drawing/2015/10/21/chartex" xmlns:cx3="http://schemas.microsoft.com/office/drawing/2016/5/9/chartex" xmlns:cx4="http://schemas.microsoft.com/office/drawing/2016/5/10/chartex" xmlns:cx5="http://schemas.microsoft.com/office/drawing/2016/5/11/chartex" xmlns:cx6="http://schemas.microsoft.com/office/drawing/2016/5/12/chartex" xmlns:cx7="http://schemas.microsoft.com/office/drawing/2016/5/13/chartex" xmlns:cx8="http://schemas.microsoft.com/office/drawing/2016/5/14/chartex" xmlns:mc="http://schemas.openxmlformats.org/markup-compatibility/2006" xmlns:aink="http://schemas.microsoft.com/office/drawing/2016/ink" xmlns:am3d="http://schemas.microsoft.com/office/drawing/2017/model3d" xmlns:o="urn:schemas-microsoft-com:office:office" xmlns:oel="http://schemas.microsoft.com/office/2019/extlst" xmlns:r="http://schemas.openxmlformats.org/officeDocument/2006/relationships" xmlns:m="http://schemas.openxmlformats.org/officeDocument/2006/math" xmlns:v="urn:schemas-microsoft-com:vml" xmlns:wp14="http://schemas.microsoft.com/office/word/2010/wordprocessingDrawing" xmlns:wp="http://schemas.openxmlformats.org/drawingml/2006/wordprocessingDrawing" xmlns:w10="urn:schemas-microsoft-com:office:word" xmlns:w="http://schemas.openxmlformats.org/wordprocessingml/2006/main" xmlns:w14="http://schemas.microsoft.com/office/word/2010/wordml" xmlns:w15="http://schemas.microsoft.com/office/word/2012/wordml" xmlns:w16cex="http://schemas.microsoft.com/office/word/2018/wordml/cex" xmlns:w16cid="http://schemas.microsoft.com/office/word/2016/wordml/cid" xmlns:w16="http://schemas.microsoft.com/office/word/2018/wordml" xmlns:w16du="http://schemas.microsoft.com/office/word/2023/wordml/word16du" xmlns:w16sdtdh="http://schemas.microsoft.com/office/word/2020/wordml/sdtdatahash" xmlns:w16sdtfl="http://schemas.microsoft.com/office/word/2024/wordml/sdtformatlock" xmlns:w16se="http://schemas.microsoft.com/office/word/2015/wordml/symex" xmlns:wpg="http://schemas.microsoft.com/office/word/2010/wordprocessingGroup" xmlns:wpi="http://schemas.microsoft.com/office/word/2010/wordprocessingInk" xmlns:wne="http://schemas.microsoft.com/office/word/2006/wordml" xmlns:wps="http://schemas.microsoft.com/office/word/2010/wordprocessingShape" mc:Ignorable="w14 w15 w16se w16cid w16 w16cex w16sdtdh w16sdtfl w16du wp14">
+<w:numbering xmlns:wpc="http://schemas.microsoft.com/office/word/2010/wordprocessingCanvas" xmlns:cx="http://schemas.microsoft.com/office/drawing/2014/chartex" xmlns:mc="http://schemas.openxmlformats.org/markup-compatibility/2006" xmlns:o="urn:schemas-microsoft-com:office:office" xmlns:r="http://schemas.openxmlformats.org/officeDocument/2006/relationships" xmlns:m="http://schemas.openxmlformats.org/officeDocument/2006/math" xmlns:v="urn:schemas-microsoft-com:vml" xmlns:wp14="http://schemas.microsoft.com/office/word/2010/wordprocessingDrawing" xmlns:wp="http://schemas.openxmlformats.org/drawingml/2006/wordprocessingDrawing" xmlns:w10="urn:schemas-microsoft-com:office:word" xmlns:w="http://schemas.openxmlformats.org/wordprocessingml/2006/main" xmlns:w14="http://schemas.microsoft.com/office/word/2010/wordml" xmlns:w15="http://schemas.microsoft.com/office/word/2012/wordml" xmlns:w16se="http://schemas.microsoft.com/office/word/2015/wordml/symex" xmlns:wpg="http://schemas.microsoft.com/office/word/2010/wordprocessingGroup" xmlns:wpi="http://schemas.microsoft.com/office/word/2010/wordprocessingInk" xmlns:wne="http://schemas.microsoft.com/office/word/2006/wordml" xmlns:wps="http://schemas.microsoft.com/office/word/2010/wordprocessingShape" mc:Ignorable="w14 w15 w16se wp14">
   <w:abstractNum w:abstractNumId="0" w15:restartNumberingAfterBreak="0">
     <w:nsid w:val="75947AC2"/>
     <w:multiLevelType w:val="hybridMultilevel"/>
@@ -20521,13 +20639,13 @@
       </w:pPr>
     </w:lvl>
   </w:abstractNum>
-  <w:num w:numId="1" w16cid:durableId="107747512">
+  <w:num w:numId="1">
     <w:abstractNumId w:val="1"/>
     <w:lvlOverride w:ilvl="0">
       <w:startOverride w:val="1"/>
     </w:lvlOverride>
   </w:num>
-  <w:num w:numId="2" w16cid:durableId="1713074512">
+  <w:num w:numId="2">
     <w:abstractNumId w:val="0"/>
     <w:lvlOverride w:ilvl="0">
       <w:startOverride w:val="1"/>
@@ -20537,7 +20655,7 @@
 </file>
 
 <file path=word/styles.xml><?xml version="1.0" encoding="utf-8"?>
-<w:styles xmlns:mc="http://schemas.openxmlformats.org/markup-compatibility/2006" xmlns:r="http://schemas.openxmlformats.org/officeDocument/2006/relationships" xmlns:w="http://schemas.openxmlformats.org/wordprocessingml/2006/main" xmlns:w14="http://schemas.microsoft.com/office/word/2010/wordml" xmlns:w15="http://schemas.microsoft.com/office/word/2012/wordml" xmlns:w16cex="http://schemas.microsoft.com/office/word/2018/wordml/cex" xmlns:w16cid="http://schemas.microsoft.com/office/word/2016/wordml/cid" xmlns:w16="http://schemas.microsoft.com/office/word/2018/wordml" xmlns:w16du="http://schemas.microsoft.com/office/word/2023/wordml/word16du" xmlns:w16sdtdh="http://schemas.microsoft.com/office/word/2020/wordml/sdtdatahash" xmlns:w16sdtfl="http://schemas.microsoft.com/office/word/2024/wordml/sdtformatlock" xmlns:w16se="http://schemas.microsoft.com/office/word/2015/wordml/symex" mc:Ignorable="w14 w15 w16se w16cid w16 w16cex w16sdtdh w16sdtfl w16du">
+<w:styles xmlns:mc="http://schemas.openxmlformats.org/markup-compatibility/2006" xmlns:r="http://schemas.openxmlformats.org/officeDocument/2006/relationships" xmlns:w="http://schemas.openxmlformats.org/wordprocessingml/2006/main" xmlns:w14="http://schemas.microsoft.com/office/word/2010/wordml" xmlns:w15="http://schemas.microsoft.com/office/word/2012/wordml" xmlns:w16se="http://schemas.microsoft.com/office/word/2015/wordml/symex" mc:Ignorable="w14 w15 w16se">
   <w:docDefaults>
     <w:rPrDefault>
       <w:rPr>
@@ -20549,7 +20667,7 @@
     </w:rPrDefault>
     <w:pPrDefault/>
   </w:docDefaults>
-  <w:latentStyles w:defLockedState="0" w:defUIPriority="99" w:defSemiHidden="0" w:defUnhideWhenUsed="0" w:defQFormat="0" w:count="376">
+  <w:latentStyles w:defLockedState="0" w:defUIPriority="99" w:defSemiHidden="0" w:defUnhideWhenUsed="0" w:defQFormat="0" w:count="371">
     <w:lsdException w:name="Normal" w:uiPriority="0" w:qFormat="1"/>
     <w:lsdException w:name="heading 1" w:uiPriority="9" w:qFormat="1"/>
     <w:lsdException w:name="heading 2" w:semiHidden="1" w:uiPriority="9" w:unhideWhenUsed="1" w:qFormat="1"/>
@@ -20921,11 +21039,6 @@
     <w:lsdException w:name="List Table 5 Dark Accent 6" w:uiPriority="50"/>
     <w:lsdException w:name="List Table 6 Colorful Accent 6" w:uiPriority="51"/>
     <w:lsdException w:name="List Table 7 Colorful Accent 6" w:uiPriority="52"/>
-    <w:lsdException w:name="Mention" w:semiHidden="1" w:unhideWhenUsed="1"/>
-    <w:lsdException w:name="Smart Hyperlink" w:semiHidden="1" w:unhideWhenUsed="1"/>
-    <w:lsdException w:name="Hashtag" w:semiHidden="1" w:unhideWhenUsed="1"/>
-    <w:lsdException w:name="Unresolved Mention" w:semiHidden="1" w:unhideWhenUsed="1"/>
-    <w:lsdException w:name="Smart Link" w:semiHidden="1" w:unhideWhenUsed="1"/>
   </w:latentStyles>
   <w:style w:type="paragraph" w:default="1" w:styleId="Normale">
     <w:name w:val="Normal"/>
@@ -21184,7 +21297,7 @@
     <w:uiPriority w:val="99"/>
     <w:rsid w:val="00C8221E"/>
   </w:style>
-  <w:style w:type="character" w:styleId="Menzionenonrisolta">
+  <w:style w:type="character" w:customStyle="1" w:styleId="UnresolvedMention">
     <w:name w:val="Unresolved Mention"/>
     <w:basedOn w:val="Carpredefinitoparagrafo"/>
     <w:uiPriority w:val="99"/>
@@ -21216,10 +21329,10 @@
   <a:themeElements>
     <a:clrScheme name="Office">
       <a:dk1>
-        <a:sysClr val="windowText" lastClr="C6C6C6"/>
+        <a:sysClr val="windowText" lastClr="000000"/>
       </a:dk1>
       <a:lt1>
-        <a:sysClr val="window" lastClr="000000"/>
+        <a:sysClr val="window" lastClr="FFFFFF"/>
       </a:lt1>
       <a:dk2>
         <a:srgbClr val="0E2841"/>

</xml_diff>